<commit_message>
actualization of the draft
</commit_message>
<xml_diff>
--- a/DRAFT_report.docx
+++ b/DRAFT_report.docx
@@ -322,7 +322,7 @@
         <mc:AlternateContent>
           <mc:Choice Requires="wps">
             <w:drawing>
-              <wp:anchor distT="0" distB="0" distL="114300" distR="114300" simplePos="0" relativeHeight="251663360" behindDoc="1" locked="0" layoutInCell="1" allowOverlap="1" wp14:anchorId="1682F129" wp14:editId="7EDA0A77">
+              <wp:anchor distT="0" distB="0" distL="114300" distR="114300" simplePos="0" relativeHeight="251663360" behindDoc="1" locked="0" layoutInCell="1" allowOverlap="1" wp14:anchorId="1682F129" wp14:editId="559A0A11">
                 <wp:simplePos x="0" y="0"/>
                 <wp:positionH relativeFrom="margin">
                   <wp:align>left</wp:align>
@@ -330,13 +330,13 @@
                 <wp:positionV relativeFrom="paragraph">
                   <wp:posOffset>6002020</wp:posOffset>
                 </wp:positionV>
-                <wp:extent cx="4610100" cy="2008505"/>
+                <wp:extent cx="4610100" cy="2371725"/>
                 <wp:effectExtent l="0" t="0" r="0" b="0"/>
                 <wp:wrapTight wrapText="bothSides">
                   <wp:wrapPolygon edited="0">
                     <wp:start x="268" y="0"/>
-                    <wp:lineTo x="268" y="21306"/>
-                    <wp:lineTo x="21332" y="21306"/>
+                    <wp:lineTo x="268" y="21340"/>
+                    <wp:lineTo x="21332" y="21340"/>
                     <wp:lineTo x="21332" y="0"/>
                     <wp:lineTo x="268" y="0"/>
                   </wp:wrapPolygon>
@@ -350,7 +350,7 @@
                       <wps:spPr>
                         <a:xfrm>
                           <a:off x="0" y="0"/>
-                          <a:ext cx="4610100" cy="2008909"/>
+                          <a:ext cx="4610100" cy="2371725"/>
                         </a:xfrm>
                         <a:prstGeom prst="rect">
                           <a:avLst/>
@@ -401,15 +401,7 @@
                                 <w:szCs w:val="36"/>
                                 <w:lang w:val="es-ES" w:bidi="es-ES"/>
                               </w:rPr>
-                              <w:t xml:space="preserve">Alexander Pérez </w:t>
-                            </w:r>
-                            <w:r>
-                              <w:rPr>
-                                <w:sz w:val="36"/>
-                                <w:szCs w:val="36"/>
-                                <w:lang w:val="es-ES" w:bidi="es-ES"/>
-                              </w:rPr>
-                              <w:t>Bunea, 636393</w:t>
+                              <w:t>Alexander Pérez Bunea, 636393</w:t>
                             </w:r>
                           </w:p>
                           <w:p>
@@ -471,12 +463,6 @@
                             </w:r>
                           </w:p>
                           <w:p>
-                            <w:pPr>
-                              <w:rPr>
-                                <w:sz w:val="32"/>
-                                <w:szCs w:val="32"/>
-                              </w:rPr>
-                            </w:pPr>
                             <w:r>
                               <w:rPr>
                                 <w:sz w:val="32"/>
@@ -499,6 +485,56 @@
                                   <w:szCs w:val="32"/>
                                 </w:rPr>
                                 <w:t>CODE</w:t>
+                              </w:r>
+                            </w:hyperlink>
+                          </w:p>
+                          <w:p>
+                            <w:pPr>
+                              <w:rPr>
+                                <w:sz w:val="32"/>
+                                <w:szCs w:val="32"/>
+                              </w:rPr>
+                            </w:pPr>
+                            <w:r>
+                              <w:rPr>
+                                <w:sz w:val="32"/>
+                                <w:szCs w:val="32"/>
+                              </w:rPr>
+                              <w:t xml:space="preserve">Link to the official GitHub repository: </w:t>
+                            </w:r>
+                            <w:hyperlink r:id="rId10" w:history="1">
+                              <w:r>
+                                <w:rPr>
+                                  <w:rStyle w:val="Hyperlink"/>
+                                  <w:sz w:val="32"/>
+                                  <w:szCs w:val="32"/>
+                                </w:rPr>
+                                <w:t>CODE</w:t>
+                              </w:r>
+                            </w:hyperlink>
+                          </w:p>
+                          <w:p>
+                            <w:pPr>
+                              <w:rPr>
+                                <w:sz w:val="32"/>
+                                <w:szCs w:val="32"/>
+                              </w:rPr>
+                            </w:pPr>
+                            <w:r>
+                              <w:rPr>
+                                <w:sz w:val="32"/>
+                                <w:szCs w:val="32"/>
+                              </w:rPr>
+                              <w:t xml:space="preserve">Link to the official paper: </w:t>
+                            </w:r>
+                            <w:hyperlink r:id="rId11" w:history="1">
+                              <w:r>
+                                <w:rPr>
+                                  <w:rStyle w:val="Hyperlink"/>
+                                  <w:sz w:val="32"/>
+                                  <w:szCs w:val="32"/>
+                                </w:rPr>
+                                <w:t>PAPER</w:t>
                               </w:r>
                             </w:hyperlink>
                           </w:p>
@@ -526,7 +562,7 @@
           </mc:Choice>
           <mc:Fallback>
             <w:pict>
-              <v:shape w14:anchorId="1682F129" id="Cuadro de texto 13" o:spid="_x0000_s1027" type="#_x0000_t202" style="position:absolute;margin-left:0;margin-top:472.6pt;width:363pt;height:158.15pt;z-index:-251653120;visibility:visible;mso-wrap-style:square;mso-width-percent:0;mso-height-percent:0;mso-wrap-distance-left:9pt;mso-wrap-distance-top:0;mso-wrap-distance-right:9pt;mso-wrap-distance-bottom:0;mso-position-horizontal:left;mso-position-horizontal-relative:margin;mso-position-vertical:absolute;mso-position-vertical-relative:text;mso-width-percent:0;mso-height-percent:0;mso-width-relative:margin;mso-height-relative:margin;v-text-anchor:top" o:gfxdata="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" filled="f" stroked="f" strokeweight=".5pt">
+              <v:shape w14:anchorId="1682F129" id="Cuadro de texto 13" o:spid="_x0000_s1027" type="#_x0000_t202" style="position:absolute;margin-left:0;margin-top:472.6pt;width:363pt;height:186.75pt;z-index:-251653120;visibility:visible;mso-wrap-style:square;mso-width-percent:0;mso-height-percent:0;mso-wrap-distance-left:9pt;mso-wrap-distance-top:0;mso-wrap-distance-right:9pt;mso-wrap-distance-bottom:0;mso-position-horizontal:left;mso-position-horizontal-relative:margin;mso-position-vertical:absolute;mso-position-vertical-relative:text;mso-width-percent:0;mso-height-percent:0;mso-width-relative:margin;mso-height-relative:margin;v-text-anchor:top" o:gfxdata="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" filled="f" stroked="f" strokeweight=".5pt">
                 <v:textbox>
                   <w:txbxContent>
                     <w:p>
@@ -568,15 +604,7 @@
                           <w:szCs w:val="36"/>
                           <w:lang w:val="es-ES" w:bidi="es-ES"/>
                         </w:rPr>
-                        <w:t xml:space="preserve">Alexander Pérez </w:t>
-                      </w:r>
-                      <w:r>
-                        <w:rPr>
-                          <w:sz w:val="36"/>
-                          <w:szCs w:val="36"/>
-                          <w:lang w:val="es-ES" w:bidi="es-ES"/>
-                        </w:rPr>
-                        <w:t>Bunea, 636393</w:t>
+                        <w:t>Alexander Pérez Bunea, 636393</w:t>
                       </w:r>
                     </w:p>
                     <w:p>
@@ -638,12 +666,6 @@
                       </w:r>
                     </w:p>
                     <w:p>
-                      <w:pPr>
-                        <w:rPr>
-                          <w:sz w:val="32"/>
-                          <w:szCs w:val="32"/>
-                        </w:rPr>
-                      </w:pPr>
                       <w:r>
                         <w:rPr>
                           <w:sz w:val="32"/>
@@ -658,7 +680,7 @@
                         </w:rPr>
                         <w:t xml:space="preserve"> </w:t>
                       </w:r>
-                      <w:hyperlink r:id="rId10" w:history="1">
+                      <w:hyperlink r:id="rId12" w:history="1">
                         <w:r>
                           <w:rPr>
                             <w:rStyle w:val="Hyperlink"/>
@@ -666,6 +688,56 @@
                             <w:szCs w:val="32"/>
                           </w:rPr>
                           <w:t>CODE</w:t>
+                        </w:r>
+                      </w:hyperlink>
+                    </w:p>
+                    <w:p>
+                      <w:pPr>
+                        <w:rPr>
+                          <w:sz w:val="32"/>
+                          <w:szCs w:val="32"/>
+                        </w:rPr>
+                      </w:pPr>
+                      <w:r>
+                        <w:rPr>
+                          <w:sz w:val="32"/>
+                          <w:szCs w:val="32"/>
+                        </w:rPr>
+                        <w:t xml:space="preserve">Link to the official GitHub repository: </w:t>
+                      </w:r>
+                      <w:hyperlink r:id="rId13" w:history="1">
+                        <w:r>
+                          <w:rPr>
+                            <w:rStyle w:val="Hyperlink"/>
+                            <w:sz w:val="32"/>
+                            <w:szCs w:val="32"/>
+                          </w:rPr>
+                          <w:t>CODE</w:t>
+                        </w:r>
+                      </w:hyperlink>
+                    </w:p>
+                    <w:p>
+                      <w:pPr>
+                        <w:rPr>
+                          <w:sz w:val="32"/>
+                          <w:szCs w:val="32"/>
+                        </w:rPr>
+                      </w:pPr>
+                      <w:r>
+                        <w:rPr>
+                          <w:sz w:val="32"/>
+                          <w:szCs w:val="32"/>
+                        </w:rPr>
+                        <w:t xml:space="preserve">Link to the official paper: </w:t>
+                      </w:r>
+                      <w:hyperlink r:id="rId14" w:history="1">
+                        <w:r>
+                          <w:rPr>
+                            <w:rStyle w:val="Hyperlink"/>
+                            <w:sz w:val="32"/>
+                            <w:szCs w:val="32"/>
+                          </w:rPr>
+                          <w:t>PAPER</w:t>
                         </w:r>
                       </w:hyperlink>
                     </w:p>
@@ -708,10 +780,10 @@
                     <pic:cNvPicPr/>
                   </pic:nvPicPr>
                   <pic:blipFill>
-                    <a:blip r:embed="rId11">
+                    <a:blip r:embed="rId15">
                       <a:extLst>
                         <a:ext uri="{96DAC541-7B7A-43D3-8B79-37D633B846F1}">
-                          <asvg:svgBlip xmlns:asvg="http://schemas.microsoft.com/office/drawing/2016/SVG/main" r:embed="rId12"/>
+                          <asvg:svgBlip xmlns:asvg="http://schemas.microsoft.com/office/drawing/2016/SVG/main" r:embed="rId16"/>
                         </a:ext>
                       </a:extLst>
                     </a:blip>
@@ -769,10 +841,10 @@
                     <pic:cNvPicPr/>
                   </pic:nvPicPr>
                   <pic:blipFill>
-                    <a:blip r:embed="rId13">
+                    <a:blip r:embed="rId17">
                       <a:extLst>
                         <a:ext uri="{96DAC541-7B7A-43D3-8B79-37D633B846F1}">
-                          <asvg:svgBlip xmlns:asvg="http://schemas.microsoft.com/office/drawing/2016/SVG/main" r:embed="rId14"/>
+                          <asvg:svgBlip xmlns:asvg="http://schemas.microsoft.com/office/drawing/2016/SVG/main" r:embed="rId18"/>
                         </a:ext>
                       </a:extLst>
                     </a:blip>
@@ -830,10 +902,10 @@
                     <pic:cNvPicPr/>
                   </pic:nvPicPr>
                   <pic:blipFill>
-                    <a:blip r:embed="rId15">
+                    <a:blip r:embed="rId19">
                       <a:extLst>
                         <a:ext uri="{96DAC541-7B7A-43D3-8B79-37D633B846F1}">
-                          <asvg:svgBlip xmlns:asvg="http://schemas.microsoft.com/office/drawing/2016/SVG/main" r:embed="rId16"/>
+                          <asvg:svgBlip xmlns:asvg="http://schemas.microsoft.com/office/drawing/2016/SVG/main" r:embed="rId20"/>
                         </a:ext>
                       </a:extLst>
                     </a:blip>
@@ -908,6 +980,29 @@
             <w:pStyle w:val="TOC1"/>
           </w:pPr>
           <w:r>
+            <w:t>Introduction</w:t>
+          </w:r>
+          <w:r>
+            <w:rPr>
+              <w:lang w:bidi="es-ES"/>
+            </w:rPr>
+            <w:ptab w:relativeTo="margin" w:alignment="right" w:leader="dot"/>
+          </w:r>
+          <w:r>
+            <w:rPr>
+              <w:lang w:bidi="es-ES"/>
+            </w:rPr>
+            <w:t>2</w:t>
+          </w:r>
+        </w:p>
+        <w:p>
+          <w:pPr>
+            <w:pStyle w:val="TOC1"/>
+            <w:rPr>
+              <w:lang w:bidi="es-ES"/>
+            </w:rPr>
+          </w:pPr>
+          <w:r>
             <w:t>Model’s architecture</w:t>
           </w:r>
           <w:r>
@@ -921,6 +1016,126 @@
               <w:lang w:bidi="es-ES"/>
             </w:rPr>
             <w:t>2</w:t>
+          </w:r>
+        </w:p>
+        <w:p>
+          <w:pPr>
+            <w:pStyle w:val="TOC2"/>
+            <w:ind w:left="216"/>
+            <w:rPr>
+              <w:lang w:bidi="es-ES"/>
+            </w:rPr>
+          </w:pPr>
+          <w:r>
+            <w:rPr>
+              <w:b w:val="0"/>
+              <w:bCs/>
+            </w:rPr>
+            <w:t>Architecture basics</w:t>
+          </w:r>
+          <w:r>
+            <w:rPr>
+              <w:b w:val="0"/>
+              <w:bCs/>
+            </w:rPr>
+            <w:t xml:space="preserve"> </w:t>
+          </w:r>
+          <w:r>
+            <w:rPr>
+              <w:lang w:bidi="es-ES"/>
+            </w:rPr>
+            <w:ptab w:relativeTo="margin" w:alignment="right" w:leader="dot"/>
+          </w:r>
+          <w:r>
+            <w:rPr>
+              <w:lang w:bidi="es-ES"/>
+            </w:rPr>
+            <w:t>4</w:t>
+          </w:r>
+        </w:p>
+        <w:p>
+          <w:pPr>
+            <w:pStyle w:val="TOC2"/>
+            <w:ind w:left="216"/>
+            <w:rPr>
+              <w:lang w:bidi="es-ES"/>
+            </w:rPr>
+          </w:pPr>
+          <w:r>
+            <w:rPr>
+              <w:b w:val="0"/>
+              <w:bCs/>
+              <w:lang w:bidi="es-ES"/>
+            </w:rPr>
+            <w:t>DLRM architecture</w:t>
+          </w:r>
+          <w:r>
+            <w:rPr>
+              <w:lang w:bidi="es-ES"/>
+            </w:rPr>
+            <w:ptab w:relativeTo="margin" w:alignment="right" w:leader="dot"/>
+          </w:r>
+          <w:r>
+            <w:rPr>
+              <w:lang w:bidi="es-ES"/>
+            </w:rPr>
+            <w:t>5</w:t>
+          </w:r>
+        </w:p>
+        <w:p>
+          <w:pPr>
+            <w:pStyle w:val="TOC2"/>
+            <w:ind w:left="216"/>
+            <w:rPr>
+              <w:lang w:bidi="es-ES"/>
+            </w:rPr>
+          </w:pPr>
+          <w:r>
+            <w:rPr>
+              <w:b w:val="0"/>
+              <w:bCs/>
+            </w:rPr>
+            <w:t>Parallelism</w:t>
+          </w:r>
+          <w:r>
+            <w:rPr>
+              <w:lang w:bidi="es-ES"/>
+            </w:rPr>
+            <w:ptab w:relativeTo="margin" w:alignment="right" w:leader="dot"/>
+          </w:r>
+          <w:r>
+            <w:rPr>
+              <w:lang w:bidi="es-ES"/>
+            </w:rPr>
+            <w:t>6</w:t>
+          </w:r>
+        </w:p>
+        <w:p>
+          <w:pPr>
+            <w:pStyle w:val="TOC2"/>
+            <w:ind w:left="216"/>
+            <w:rPr>
+              <w:lang w:bidi="es-ES"/>
+            </w:rPr>
+          </w:pPr>
+          <w:r>
+            <w:rPr>
+              <w:b w:val="0"/>
+              <w:bCs/>
+            </w:rPr>
+            <w:t>Experiments done by Meta</w:t>
+          </w:r>
+          <w:r>
+            <w:rPr>
+              <w:lang w:bidi="es-ES"/>
+            </w:rPr>
+            <w:ptab w:relativeTo="margin" w:alignment="right" w:leader="dot"/>
+          </w:r>
+          <w:r>
+            <w:rPr>
+              <w:lang w:bidi="es-ES"/>
+            </w:rPr>
+            <w:t>6</w:t>
           </w:r>
         </w:p>
         <w:p>
@@ -1180,15 +1395,6 @@
         </w:p>
         <w:p>
           <w:pPr>
-            <w:pStyle w:val="TOC2"/>
-            <w:ind w:left="216"/>
-            <w:rPr>
-              <w:lang w:bidi="es-ES"/>
-            </w:rPr>
-          </w:pPr>
-        </w:p>
-        <w:p>
-          <w:pPr>
             <w:pStyle w:val="TOC1"/>
             <w:rPr>
               <w:lang w:bidi="es-ES"/>
@@ -1325,7 +1531,144 @@
                 <w:lang w:bidi="es-ES"/>
               </w:rPr>
               <w:lastRenderedPageBreak/>
+              <w:t>INTRODUCTION</w:t>
+            </w:r>
+          </w:p>
+          <w:p>
+            <w:pPr>
+              <w:rPr>
+                <w:b w:val="0"/>
+                <w:bCs/>
+                <w:lang w:bidi="es-ES"/>
+              </w:rPr>
+            </w:pPr>
+            <w:r>
+              <w:rPr>
+                <w:b w:val="0"/>
+                <w:bCs/>
+                <w:lang w:bidi="es-ES"/>
+              </w:rPr>
+              <w:t xml:space="preserve">The evolution of recommendation systems began with content-based filtering, where experts categorized products, and users chose their preferred categories to receive suggestions. Over time, the approach shifted to collaborative filtering, which relies on past user </w:t>
+            </w:r>
+            <w:r>
+              <w:rPr>
+                <w:b w:val="0"/>
+                <w:bCs/>
+                <w:lang w:bidi="es-ES"/>
+              </w:rPr>
+              <w:t>behaviour</w:t>
+            </w:r>
+            <w:r>
+              <w:rPr>
+                <w:b w:val="0"/>
+                <w:bCs/>
+                <w:lang w:bidi="es-ES"/>
+              </w:rPr>
+              <w:t xml:space="preserve">, such as ratings, to make recommendations. Methods like </w:t>
+            </w:r>
+            <w:r>
+              <w:rPr>
+                <w:b w:val="0"/>
+                <w:bCs/>
+                <w:lang w:bidi="es-ES"/>
+              </w:rPr>
+              <w:t>neighbourhood</w:t>
+            </w:r>
+            <w:r>
+              <w:rPr>
+                <w:b w:val="0"/>
+                <w:bCs/>
+                <w:lang w:bidi="es-ES"/>
+              </w:rPr>
+              <w:t>-based approaches, which group similar users and products, and latent factor models, which use matrix factorization to uncover implicit factors that describe users and products, were successfully implemented. Although these methods have been</w:t>
+            </w:r>
+            <w:r>
+              <w:rPr>
+                <w:b w:val="0"/>
+                <w:bCs/>
+                <w:lang w:bidi="es-ES"/>
+              </w:rPr>
+              <w:t xml:space="preserve"> proof to be really successful</w:t>
+            </w:r>
+            <w:r>
+              <w:rPr>
+                <w:b w:val="0"/>
+                <w:bCs/>
+                <w:lang w:bidi="es-ES"/>
+              </w:rPr>
+              <w:t>, it is only recently that they have incorporated neural networks into their techniques.</w:t>
+            </w:r>
+            <w:r>
+              <w:rPr>
+                <w:b w:val="0"/>
+                <w:bCs/>
+                <w:lang w:bidi="es-ES"/>
+              </w:rPr>
+              <w:t xml:space="preserve"> This is why we are studying a Deep Learning recommendation System</w:t>
+            </w:r>
+            <w:r>
+              <w:rPr>
+                <w:b w:val="0"/>
+                <w:bCs/>
+                <w:lang w:bidi="es-ES"/>
+              </w:rPr>
+              <w:t xml:space="preserve">, model developed and studied by Meta and </w:t>
+            </w:r>
+            <w:proofErr w:type="spellStart"/>
+            <w:r>
+              <w:rPr>
+                <w:b w:val="0"/>
+                <w:bCs/>
+                <w:lang w:bidi="es-ES"/>
+              </w:rPr>
+              <w:t>it’s</w:t>
+            </w:r>
+            <w:proofErr w:type="spellEnd"/>
+            <w:r>
+              <w:rPr>
+                <w:b w:val="0"/>
+                <w:bCs/>
+                <w:lang w:bidi="es-ES"/>
+              </w:rPr>
+              <w:t xml:space="preserve"> affiliates</w:t>
+            </w:r>
+            <w:r>
+              <w:rPr>
+                <w:b w:val="0"/>
+                <w:bCs/>
+                <w:lang w:bidi="es-ES"/>
+              </w:rPr>
+              <w:t>.</w:t>
+            </w:r>
+          </w:p>
+          <w:p>
+            <w:pPr>
+              <w:rPr>
+                <w:lang w:bidi="es-ES"/>
+              </w:rPr>
+            </w:pPr>
+          </w:p>
+          <w:p>
+            <w:pPr>
+              <w:pStyle w:val="Heading2"/>
+              <w:framePr w:hSpace="0" w:wrap="auto" w:vAnchor="margin" w:hAnchor="text" w:yAlign="inline"/>
+              <w:rPr>
+                <w:lang w:bidi="es-ES"/>
+              </w:rPr>
+            </w:pPr>
+            <w:r>
+              <w:rPr>
+                <w:lang w:bidi="es-ES"/>
+              </w:rPr>
               <w:t>MODEL’S ARCHITECTURE</w:t>
+            </w:r>
+          </w:p>
+          <w:p>
+            <w:pPr>
+              <w:pStyle w:val="Heading3"/>
+            </w:pPr>
+            <w:r>
+              <w:t>Architecture basics</w:t>
             </w:r>
           </w:p>
           <w:p>
@@ -1334,8 +1677,971 @@
               <w:framePr w:hSpace="0" w:wrap="auto" w:vAnchor="margin" w:hAnchor="text" w:yAlign="inline"/>
             </w:pPr>
             <w:r>
-              <w:t>Model’s summary</w:t>
-            </w:r>
+              <w:rPr>
+                <w:b/>
+                <w:bCs/>
+                <w:i/>
+                <w:iCs/>
+              </w:rPr>
+              <w:t>Embeddings</w:t>
+            </w:r>
+            <w:r>
+              <w:rPr>
+                <w:b/>
+                <w:bCs/>
+                <w:i/>
+                <w:iCs/>
+              </w:rPr>
+              <w:t xml:space="preserve"> </w:t>
+            </w:r>
+            <w:r>
+              <w:sym w:font="Wingdings" w:char="F0E0"/>
+            </w:r>
+            <w:r>
+              <w:t xml:space="preserve"> </w:t>
+            </w:r>
+            <w:r>
+              <w:t xml:space="preserve"> </w:t>
+            </w:r>
+            <w:r>
+              <w:t>E</w:t>
+            </w:r>
+            <w:r>
+              <w:t>mbeddings map each category to a dense representation in an abstract space</w:t>
+            </w:r>
+          </w:p>
+          <w:p>
+            <w:pPr>
+              <w:pStyle w:val="Contenido"/>
+              <w:framePr w:hSpace="0" w:wrap="auto" w:vAnchor="margin" w:hAnchor="text" w:yAlign="inline"/>
+              <w:numPr>
+                <w:ilvl w:val="0"/>
+                <w:numId w:val="40"/>
+              </w:numPr>
+              <w:rPr>
+                <w:b/>
+                <w:bCs/>
+                <w:i/>
+                <w:iCs/>
+              </w:rPr>
+            </w:pPr>
+            <w:r>
+              <w:t xml:space="preserve">DLRM </w:t>
+            </w:r>
+            <w:r>
+              <w:t>will utilize embedding tables for mapping categorical features to dense representations</w:t>
+            </w:r>
+            <w:r>
+              <w:t xml:space="preserve"> and the</w:t>
+            </w:r>
+            <w:r>
+              <w:t>n</w:t>
+            </w:r>
+            <w:r>
+              <w:t xml:space="preserve"> exploited via latent factor methods </w:t>
+            </w:r>
+            <w:r>
+              <w:t xml:space="preserve"> </w:t>
+            </w:r>
+          </w:p>
+          <w:p>
+            <w:pPr>
+              <w:pStyle w:val="Contenido"/>
+              <w:framePr w:hSpace="0" w:wrap="auto" w:vAnchor="margin" w:hAnchor="text" w:yAlign="inline"/>
+            </w:pPr>
+          </w:p>
+          <w:p>
+            <w:pPr>
+              <w:pStyle w:val="Contenido"/>
+              <w:framePr w:hSpace="0" w:wrap="auto" w:vAnchor="margin" w:hAnchor="text" w:yAlign="inline"/>
+            </w:pPr>
+            <w:r>
+              <w:rPr>
+                <w:b/>
+                <w:bCs/>
+                <w:i/>
+                <w:iCs/>
+              </w:rPr>
+              <w:t>Matrix factorization</w:t>
+            </w:r>
+            <w:r>
+              <w:rPr>
+                <w:b/>
+                <w:bCs/>
+                <w:i/>
+                <w:iCs/>
+              </w:rPr>
+              <w:t xml:space="preserve"> </w:t>
+            </w:r>
+            <w:r>
+              <w:sym w:font="Wingdings" w:char="F0E0"/>
+            </w:r>
+            <w:r>
+              <w:t xml:space="preserve"> T</w:t>
+            </w:r>
+            <w:r>
+              <w:t>echnique used in recommender systems to predict what a person might like, using only past interactions (such as ratings or clicks), using only simple matrix operations</w:t>
+            </w:r>
+          </w:p>
+          <w:p>
+            <w:pPr>
+              <w:pStyle w:val="Contenido"/>
+              <w:framePr w:hSpace="0" w:wrap="auto" w:vAnchor="margin" w:hAnchor="text" w:yAlign="inline"/>
+              <w:numPr>
+                <w:ilvl w:val="0"/>
+                <w:numId w:val="40"/>
+              </w:numPr>
+            </w:pPr>
+            <w:r>
+              <w:t>DLRM uses Matrix Factorization main idea to calculate relations between features.</w:t>
+            </w:r>
+          </w:p>
+          <w:p>
+            <w:pPr>
+              <w:pStyle w:val="Contenido"/>
+              <w:framePr w:hSpace="0" w:wrap="auto" w:vAnchor="margin" w:hAnchor="text" w:yAlign="inline"/>
+            </w:pPr>
+          </w:p>
+          <w:p>
+            <w:pPr>
+              <w:pStyle w:val="Contenido"/>
+              <w:framePr w:hSpace="0" w:wrap="auto" w:vAnchor="margin" w:hAnchor="text" w:yAlign="inline"/>
+            </w:pPr>
+            <w:r>
+              <w:rPr>
+                <w:b/>
+                <w:bCs/>
+                <w:i/>
+                <w:iCs/>
+              </w:rPr>
+              <w:t xml:space="preserve">Multi-Layer Perceptron </w:t>
+            </w:r>
+            <w:r>
+              <w:rPr>
+                <w:b/>
+                <w:bCs/>
+                <w:i/>
+                <w:iCs/>
+              </w:rPr>
+              <w:t>–</w:t>
+            </w:r>
+            <w:r>
+              <w:rPr>
+                <w:b/>
+                <w:bCs/>
+                <w:i/>
+                <w:iCs/>
+              </w:rPr>
+              <w:t xml:space="preserve"> MLP</w:t>
+            </w:r>
+            <w:r>
+              <w:rPr>
+                <w:b/>
+                <w:bCs/>
+                <w:i/>
+                <w:iCs/>
+              </w:rPr>
+              <w:t xml:space="preserve"> </w:t>
+            </w:r>
+            <w:r>
+              <w:sym w:font="Wingdings" w:char="F0E0"/>
+            </w:r>
+            <w:r>
+              <w:t xml:space="preserve"> </w:t>
+            </w:r>
+            <w:r>
+              <w:t xml:space="preserve"> </w:t>
+            </w:r>
+            <w:r>
+              <w:t>A</w:t>
+            </w:r>
+            <w:r>
+              <w:t xml:space="preserve"> prediction function composed of an interleaving sequence of fully connected (FC) layers and an activation function</w:t>
+            </w:r>
+          </w:p>
+          <w:p>
+            <w:pPr>
+              <w:pStyle w:val="Contenido"/>
+              <w:framePr w:hSpace="0" w:wrap="auto" w:vAnchor="margin" w:hAnchor="text" w:yAlign="inline"/>
+              <w:numPr>
+                <w:ilvl w:val="0"/>
+                <w:numId w:val="40"/>
+              </w:numPr>
+            </w:pPr>
+            <w:r>
+              <w:t xml:space="preserve">DLRM will use 2 layers of MLP (top and bottom), one for transforming </w:t>
+            </w:r>
+            <w:proofErr w:type="spellStart"/>
+            <w:r>
+              <w:t>continous</w:t>
+            </w:r>
+            <w:proofErr w:type="spellEnd"/>
+            <w:r>
+              <w:t xml:space="preserve"> features into dense representations and another for processing second-order interactions between features.</w:t>
+            </w:r>
+          </w:p>
+          <w:p>
+            <w:pPr>
+              <w:pStyle w:val="Contenido"/>
+              <w:framePr w:hSpace="0" w:wrap="auto" w:vAnchor="margin" w:hAnchor="text" w:yAlign="inline"/>
+            </w:pPr>
+          </w:p>
+          <w:p>
+            <w:pPr>
+              <w:pStyle w:val="Contenido"/>
+              <w:framePr w:hSpace="0" w:wrap="auto" w:vAnchor="margin" w:hAnchor="text" w:yAlign="inline"/>
+              <w:rPr>
+                <w:rFonts w:asciiTheme="majorHAnsi" w:hAnsiTheme="majorHAnsi"/>
+                <w:b/>
+                <w:sz w:val="32"/>
+                <w:szCs w:val="32"/>
+              </w:rPr>
+            </w:pPr>
+            <w:r>
+              <w:rPr>
+                <w:rFonts w:asciiTheme="majorHAnsi" w:hAnsiTheme="majorHAnsi"/>
+                <w:b/>
+                <w:sz w:val="32"/>
+                <w:szCs w:val="32"/>
+              </w:rPr>
+              <w:t>DLRM</w:t>
+            </w:r>
+            <w:r>
+              <w:rPr>
+                <w:rFonts w:asciiTheme="majorHAnsi" w:hAnsiTheme="majorHAnsi"/>
+                <w:b/>
+                <w:sz w:val="32"/>
+                <w:szCs w:val="32"/>
+              </w:rPr>
+              <w:t xml:space="preserve"> Architecture</w:t>
+            </w:r>
+          </w:p>
+          <w:p>
+            <w:pPr>
+              <w:pStyle w:val="Contenido"/>
+              <w:framePr w:hSpace="0" w:wrap="auto" w:vAnchor="margin" w:hAnchor="text" w:yAlign="inline"/>
+            </w:pPr>
+            <w:r>
+              <w:rPr>
+                <w:u w:val="single"/>
+              </w:rPr>
+              <w:lastRenderedPageBreak/>
+              <w:t>INPUT</w:t>
+            </w:r>
+            <w:r>
+              <w:rPr>
+                <w:b/>
+                <w:bCs/>
+              </w:rPr>
+              <w:t>:</w:t>
+            </w:r>
+          </w:p>
+          <w:p>
+            <w:pPr>
+              <w:pStyle w:val="Contenido"/>
+              <w:framePr w:hSpace="0" w:wrap="auto" w:vAnchor="margin" w:hAnchor="text" w:yAlign="inline"/>
+              <w:numPr>
+                <w:ilvl w:val="0"/>
+                <w:numId w:val="41"/>
+              </w:numPr>
+            </w:pPr>
+            <w:r>
+              <w:t>Users and products</w:t>
+            </w:r>
+            <w:r>
+              <w:t xml:space="preserve"> both are </w:t>
+            </w:r>
+            <w:r>
+              <w:t xml:space="preserve">described by many </w:t>
+            </w:r>
+            <w:r>
+              <w:t xml:space="preserve">of both </w:t>
+            </w:r>
+            <w:r>
+              <w:rPr>
+                <w:b/>
+                <w:bCs/>
+              </w:rPr>
+              <w:t>continuous and categorical features</w:t>
+            </w:r>
+            <w:r>
+              <w:t>. In one hand e</w:t>
+            </w:r>
+            <w:r>
+              <w:t xml:space="preserve">ach </w:t>
+            </w:r>
+            <w:r>
+              <w:rPr>
+                <w:u w:val="single"/>
+              </w:rPr>
+              <w:t>categorical feature</w:t>
+            </w:r>
+            <w:r>
+              <w:t xml:space="preserve"> will be represented by an </w:t>
+            </w:r>
+            <w:r>
+              <w:rPr>
+                <w:u w:val="single"/>
+              </w:rPr>
+              <w:t>embedding vector</w:t>
+            </w:r>
+            <w:r>
+              <w:t>, and in another hand,</w:t>
+            </w:r>
+            <w:r>
+              <w:t xml:space="preserve"> </w:t>
+            </w:r>
+            <w:r>
+              <w:t>t</w:t>
+            </w:r>
+            <w:r>
+              <w:t xml:space="preserve">he </w:t>
+            </w:r>
+            <w:r>
+              <w:rPr>
+                <w:u w:val="single"/>
+              </w:rPr>
+              <w:t>continuous features</w:t>
+            </w:r>
+            <w:r>
+              <w:t xml:space="preserve"> will be transformed by an MLP (which we call the </w:t>
+            </w:r>
+            <w:r>
+              <w:rPr>
+                <w:b/>
+                <w:bCs/>
+              </w:rPr>
+              <w:t>bottom or dense MLP</w:t>
+            </w:r>
+            <w:r>
+              <w:t xml:space="preserve">) which will yield a </w:t>
+            </w:r>
+            <w:r>
+              <w:rPr>
+                <w:u w:val="single"/>
+              </w:rPr>
+              <w:t>dense representation</w:t>
+            </w:r>
+            <w:r>
+              <w:t xml:space="preserve"> of the same length as the </w:t>
+            </w:r>
+            <w:r>
+              <w:t xml:space="preserve">categorical </w:t>
+            </w:r>
+            <w:r>
+              <w:t>embedding vectors</w:t>
+            </w:r>
+          </w:p>
+          <w:p>
+            <w:pPr>
+              <w:pStyle w:val="Contenido"/>
+              <w:framePr w:hSpace="0" w:wrap="auto" w:vAnchor="margin" w:hAnchor="text" w:yAlign="inline"/>
+            </w:pPr>
+            <w:r>
+              <w:rPr>
+                <w:u w:val="single"/>
+              </w:rPr>
+              <w:t>INTERACTIONS</w:t>
+            </w:r>
+            <w:r>
+              <w:rPr>
+                <w:b/>
+                <w:bCs/>
+              </w:rPr>
+              <w:t>:</w:t>
+            </w:r>
+          </w:p>
+          <w:p>
+            <w:pPr>
+              <w:pStyle w:val="Contenido"/>
+              <w:framePr w:hSpace="0" w:wrap="auto" w:vAnchor="margin" w:hAnchor="text" w:yAlign="inline"/>
+              <w:numPr>
+                <w:ilvl w:val="0"/>
+                <w:numId w:val="41"/>
+              </w:numPr>
+            </w:pPr>
+            <w:r>
+              <w:t>Interactions between the dense representations</w:t>
+            </w:r>
+            <w:r>
+              <w:t xml:space="preserve"> (</w:t>
+            </w:r>
+            <w:r>
+              <w:rPr>
+                <w:b/>
+                <w:bCs/>
+                <w:color w:val="auto"/>
+              </w:rPr>
+              <w:t>Second-order interactions</w:t>
+            </w:r>
+            <w:r>
+              <w:t>)</w:t>
+            </w:r>
+            <w:r>
+              <w:t xml:space="preserve"> are calculated </w:t>
+            </w:r>
+            <w:r>
+              <w:rPr>
+                <w:color w:val="auto"/>
+              </w:rPr>
+              <w:t xml:space="preserve">by </w:t>
+            </w:r>
+            <w:r>
+              <w:rPr>
+                <w:color w:val="auto"/>
+              </w:rPr>
+              <w:t>m</w:t>
+            </w:r>
+            <w:r>
+              <w:rPr>
+                <w:color w:val="auto"/>
+              </w:rPr>
+              <w:t xml:space="preserve">aking the </w:t>
+            </w:r>
+            <w:r>
+              <w:rPr>
+                <w:b/>
+                <w:bCs/>
+                <w:color w:val="auto"/>
+              </w:rPr>
+              <w:t>dot product</w:t>
+            </w:r>
+            <w:r>
+              <w:rPr>
+                <w:color w:val="auto"/>
+              </w:rPr>
+              <w:t xml:space="preserve"> between all pairs of embedding vectors and processed dense features</w:t>
+            </w:r>
+            <w:r>
+              <w:t>.</w:t>
+            </w:r>
+          </w:p>
+          <w:p>
+            <w:pPr>
+              <w:pStyle w:val="Contenido"/>
+              <w:framePr w:hSpace="0" w:wrap="auto" w:vAnchor="margin" w:hAnchor="text" w:yAlign="inline"/>
+            </w:pPr>
+            <w:r>
+              <w:rPr>
+                <w:i/>
+                <w:iCs/>
+              </w:rPr>
+              <w:t>Note</w:t>
+            </w:r>
+            <w:r>
+              <w:t>:</w:t>
+            </w:r>
+            <w:r>
+              <w:rPr>
+                <w:rFonts w:ascii="Segoe UI" w:hAnsi="Segoe UI" w:cs="Segoe UI"/>
+                <w:color w:val="1E293B"/>
+                <w:shd w:val="clear" w:color="auto" w:fill="F1F5F9"/>
+              </w:rPr>
+              <w:t xml:space="preserve"> </w:t>
+            </w:r>
+            <w:r>
+              <w:t>Cross interactions between embeddings and MLP</w:t>
+            </w:r>
+            <w:r>
+              <w:t xml:space="preserve"> are calculated</w:t>
+            </w:r>
+            <w:r>
+              <w:t>, and also between embeddings themselves, but not between the outputs of the MLP among themselves (because there is only one output from the MLP that represents all continuous features as a single vector).</w:t>
+            </w:r>
+          </w:p>
+          <w:p>
+            <w:pPr>
+              <w:pStyle w:val="Contenido"/>
+              <w:framePr w:hSpace="0" w:wrap="auto" w:vAnchor="margin" w:hAnchor="text" w:yAlign="inline"/>
+            </w:pPr>
+            <w:r>
+              <w:rPr>
+                <w:u w:val="single"/>
+              </w:rPr>
+              <w:t>PREDICTION</w:t>
+            </w:r>
+            <w:r>
+              <w:rPr>
+                <w:b/>
+                <w:bCs/>
+              </w:rPr>
+              <w:t>:</w:t>
+            </w:r>
+          </w:p>
+          <w:p>
+            <w:pPr>
+              <w:pStyle w:val="Contenido"/>
+              <w:framePr w:hSpace="0" w:wrap="auto" w:vAnchor="margin" w:hAnchor="text" w:yAlign="inline"/>
+              <w:numPr>
+                <w:ilvl w:val="0"/>
+                <w:numId w:val="41"/>
+              </w:numPr>
+            </w:pPr>
+            <w:r>
+              <w:rPr>
+                <w:color w:val="auto"/>
+              </w:rPr>
+              <w:t xml:space="preserve">Then these dot products are concatenated and post-processed with another MLP (the top or </w:t>
+            </w:r>
+            <w:r>
+              <w:rPr>
+                <w:b/>
+                <w:bCs/>
+                <w:color w:val="auto"/>
+              </w:rPr>
+              <w:t>output MLP</w:t>
+            </w:r>
+            <w:r>
+              <w:rPr>
+                <w:color w:val="auto"/>
+              </w:rPr>
+              <w:t>),</w:t>
+            </w:r>
+            <w:r>
+              <w:rPr>
+                <w:color w:val="auto"/>
+              </w:rPr>
+              <w:t xml:space="preserve"> </w:t>
+            </w:r>
+            <w:r>
+              <w:t>t</w:t>
+            </w:r>
+            <w:r>
+              <w:t xml:space="preserve">he output is passed through a </w:t>
+            </w:r>
+            <w:r>
+              <w:rPr>
+                <w:b/>
+                <w:bCs/>
+              </w:rPr>
+              <w:t>sigmoid function</w:t>
+            </w:r>
+            <w:r>
+              <w:t xml:space="preserve">, which provides a </w:t>
+            </w:r>
+            <w:r>
+              <w:rPr>
+                <w:u w:val="single"/>
+              </w:rPr>
+              <w:t>probability</w:t>
+            </w:r>
+            <w:r>
+              <w:t xml:space="preserve"> (e.g., the likelihood of clicking or not clicking on an ad).</w:t>
+            </w:r>
+          </w:p>
+          <w:p>
+            <w:pPr>
+              <w:pStyle w:val="Contenido"/>
+              <w:framePr w:hSpace="0" w:wrap="auto" w:vAnchor="margin" w:hAnchor="text" w:yAlign="inline"/>
+              <w:jc w:val="center"/>
+            </w:pPr>
+            <w:r>
+              <w:rPr>
+                <w:noProof/>
+              </w:rPr>
+              <w:drawing>
+                <wp:inline distT="0" distB="0" distL="0" distR="0" wp14:anchorId="642F110C" wp14:editId="307F354E">
+                  <wp:extent cx="2715746" cy="2495550"/>
+                  <wp:effectExtent l="0" t="0" r="8890" b="0"/>
+                  <wp:docPr id="8182590" name="Picture 1"/>
+                  <wp:cNvGraphicFramePr>
+                    <a:graphicFrameLocks xmlns:a="http://schemas.openxmlformats.org/drawingml/2006/main" noChangeAspect="1"/>
+                  </wp:cNvGraphicFramePr>
+                  <a:graphic xmlns:a="http://schemas.openxmlformats.org/drawingml/2006/main">
+                    <a:graphicData uri="http://schemas.openxmlformats.org/drawingml/2006/picture">
+                      <pic:pic xmlns:pic="http://schemas.openxmlformats.org/drawingml/2006/picture">
+                        <pic:nvPicPr>
+                          <pic:cNvPr id="8182590" name=""/>
+                          <pic:cNvPicPr/>
+                        </pic:nvPicPr>
+                        <pic:blipFill>
+                          <a:blip r:embed="rId21">
+                            <a:extLst>
+                              <a:ext uri="{28A0092B-C50C-407E-A947-70E740481C1C}">
+                                <a14:useLocalDpi xmlns:a14="http://schemas.microsoft.com/office/drawing/2010/main" val="0"/>
+                              </a:ext>
+                            </a:extLst>
+                          </a:blip>
+                          <a:stretch>
+                            <a:fillRect/>
+                          </a:stretch>
+                        </pic:blipFill>
+                        <pic:spPr>
+                          <a:xfrm>
+                            <a:off x="0" y="0"/>
+                            <a:ext cx="2723065" cy="2502276"/>
+                          </a:xfrm>
+                          <a:prstGeom prst="rect">
+                            <a:avLst/>
+                          </a:prstGeom>
+                        </pic:spPr>
+                      </pic:pic>
+                    </a:graphicData>
+                  </a:graphic>
+                </wp:inline>
+              </w:drawing>
+            </w:r>
+          </w:p>
+          <w:p>
+            <w:pPr>
+              <w:pStyle w:val="Contenido"/>
+              <w:framePr w:hSpace="0" w:wrap="auto" w:vAnchor="margin" w:hAnchor="text" w:yAlign="inline"/>
+              <w:rPr>
+                <w:rFonts w:asciiTheme="majorHAnsi" w:hAnsiTheme="majorHAnsi"/>
+                <w:b/>
+                <w:sz w:val="32"/>
+                <w:szCs w:val="32"/>
+              </w:rPr>
+            </w:pPr>
+            <w:r>
+              <w:rPr>
+                <w:rFonts w:asciiTheme="majorHAnsi" w:hAnsiTheme="majorHAnsi"/>
+                <w:b/>
+                <w:sz w:val="32"/>
+                <w:szCs w:val="32"/>
+              </w:rPr>
+              <w:t>Parallelism</w:t>
+            </w:r>
+          </w:p>
+          <w:p>
+            <w:pPr>
+              <w:pStyle w:val="Contenido"/>
+              <w:framePr w:hSpace="0" w:wrap="auto" w:vAnchor="margin" w:hAnchor="text" w:yAlign="inline"/>
+              <w:rPr>
+                <w:bCs/>
+              </w:rPr>
+            </w:pPr>
+            <w:r>
+              <w:rPr>
+                <w:bCs/>
+              </w:rPr>
+              <w:t>DLRMs (Deep Learning Recommendation Models) are known for having an exceptionally large number of parameters, which can lead to training times that extend over several weeks if parallelism is not employed.</w:t>
+            </w:r>
+            <w:r>
+              <w:rPr>
+                <w:bCs/>
+              </w:rPr>
+              <w:t xml:space="preserve">  </w:t>
+            </w:r>
+            <w:r>
+              <w:rPr>
+                <w:bCs/>
+              </w:rPr>
+              <w:t>Embeddings contribute the majority of the parameters because it uses several tables.</w:t>
+            </w:r>
+            <w:r>
+              <w:rPr>
+                <w:bCs/>
+              </w:rPr>
+              <w:t xml:space="preserve">  </w:t>
+            </w:r>
+            <w:r>
+              <w:rPr>
+                <w:bCs/>
+              </w:rPr>
+              <w:t>Because of the size</w:t>
+            </w:r>
+            <w:r>
+              <w:rPr>
+                <w:bCs/>
+              </w:rPr>
+              <w:t xml:space="preserve"> of the embeddings</w:t>
+            </w:r>
+            <w:r>
+              <w:rPr>
+                <w:bCs/>
+              </w:rPr>
+              <w:t>, applying traditional data parallelism becomes impractical</w:t>
+            </w:r>
+            <w:r>
+              <w:rPr>
+                <w:bCs/>
+              </w:rPr>
+              <w:t>.</w:t>
+            </w:r>
+          </w:p>
+          <w:p>
+            <w:pPr>
+              <w:pStyle w:val="Contenido"/>
+              <w:framePr w:hSpace="0" w:wrap="auto" w:vAnchor="margin" w:hAnchor="text" w:yAlign="inline"/>
+              <w:rPr>
+                <w:bCs/>
+              </w:rPr>
+            </w:pPr>
+            <w:r>
+              <w:rPr>
+                <w:bCs/>
+              </w:rPr>
+              <w:t xml:space="preserve">To address this, a hybrid parallelization strategy is used: model parallelism is applied to the embedding tables, while data parallelism is reserved for the MLP components. This </w:t>
+            </w:r>
+            <w:r>
+              <w:rPr>
+                <w:bCs/>
+              </w:rPr>
+              <w:lastRenderedPageBreak/>
+              <w:t>combination helps alleviate the memory bottlenecks caused by the embeddings and allows efficient parallelization of the forward and backward passes of the MLPs. However,</w:t>
+            </w:r>
+            <w:r>
+              <w:rPr>
+                <w:bCs/>
+              </w:rPr>
+              <w:t xml:space="preserve"> </w:t>
+            </w:r>
+            <w:r>
+              <w:rPr>
+                <w:bCs/>
+              </w:rPr>
+              <w:t xml:space="preserve">frameworks like Caffe2 and </w:t>
+            </w:r>
+            <w:proofErr w:type="spellStart"/>
+            <w:r>
+              <w:rPr>
+                <w:bCs/>
+              </w:rPr>
+              <w:t>PyTorch</w:t>
+            </w:r>
+            <w:proofErr w:type="spellEnd"/>
+            <w:r>
+              <w:rPr>
+                <w:bCs/>
+              </w:rPr>
+              <w:t xml:space="preserve"> do not natively support this kind of combined parallelism. As a result, a custom implementation was developed.</w:t>
+            </w:r>
+          </w:p>
+          <w:p>
+            <w:pPr>
+              <w:spacing w:after="160" w:line="259" w:lineRule="auto"/>
+              <w:rPr>
+                <w:b w:val="0"/>
+                <w:bCs/>
+              </w:rPr>
+            </w:pPr>
+            <w:r>
+              <w:rPr>
+                <w:b w:val="0"/>
+                <w:bCs/>
+              </w:rPr>
+              <w:t>Custom implementation:</w:t>
+            </w:r>
+          </w:p>
+          <w:p>
+            <w:pPr>
+              <w:pStyle w:val="ListParagraph"/>
+              <w:numPr>
+                <w:ilvl w:val="0"/>
+                <w:numId w:val="42"/>
+              </w:numPr>
+              <w:spacing w:after="160" w:line="259" w:lineRule="auto"/>
+              <w:rPr>
+                <w:b w:val="0"/>
+                <w:bCs/>
+              </w:rPr>
+            </w:pPr>
+            <w:r>
+              <w:rPr>
+                <w:b w:val="0"/>
+                <w:bCs/>
+                <w:u w:val="single"/>
+              </w:rPr>
+              <w:t>Parallelism</w:t>
+            </w:r>
+            <w:r>
+              <w:rPr>
+                <w:b w:val="0"/>
+                <w:bCs/>
+              </w:rPr>
+              <w:t xml:space="preserve"> </w:t>
+            </w:r>
+            <w:r>
+              <w:rPr>
+                <w:b w:val="0"/>
+                <w:bCs/>
+              </w:rPr>
+              <w:sym w:font="Wingdings" w:char="F0E0"/>
+            </w:r>
+            <w:r>
+              <w:rPr>
+                <w:b w:val="0"/>
+                <w:bCs/>
+              </w:rPr>
+              <w:t xml:space="preserve"> by explicitly mapping the embedding operators to different devices.</w:t>
+            </w:r>
+          </w:p>
+          <w:p>
+            <w:pPr>
+              <w:pStyle w:val="ListParagraph"/>
+              <w:numPr>
+                <w:ilvl w:val="0"/>
+                <w:numId w:val="42"/>
+              </w:numPr>
+              <w:spacing w:after="160" w:line="259" w:lineRule="auto"/>
+              <w:rPr>
+                <w:b w:val="0"/>
+                <w:bCs/>
+              </w:rPr>
+            </w:pPr>
+            <w:r>
+              <w:rPr>
+                <w:b w:val="0"/>
+                <w:bCs/>
+                <w:u w:val="single"/>
+              </w:rPr>
+              <w:t>Communication</w:t>
+            </w:r>
+            <w:r>
+              <w:rPr>
+                <w:b w:val="0"/>
+                <w:bCs/>
+              </w:rPr>
+              <w:t xml:space="preserve"> </w:t>
+            </w:r>
+            <w:r>
+              <w:rPr>
+                <w:b w:val="0"/>
+                <w:bCs/>
+              </w:rPr>
+              <w:sym w:font="Wingdings" w:char="F0E0"/>
+            </w:r>
+            <w:r>
+              <w:rPr>
+                <w:b w:val="0"/>
+                <w:bCs/>
+              </w:rPr>
+              <w:t xml:space="preserve"> by using the butterfly shuffle operator, which appropriately slices the resulting embedding vectors and transfers them to the target devices</w:t>
+            </w:r>
+          </w:p>
+          <w:p>
+            <w:pPr>
+              <w:pStyle w:val="Contenido"/>
+              <w:framePr w:hSpace="0" w:wrap="auto" w:vAnchor="margin" w:hAnchor="text" w:yAlign="inline"/>
+            </w:pPr>
+          </w:p>
+          <w:p>
+            <w:pPr>
+              <w:pStyle w:val="Contenido"/>
+              <w:framePr w:hSpace="0" w:wrap="auto" w:vAnchor="margin" w:hAnchor="text" w:yAlign="inline"/>
+            </w:pPr>
+          </w:p>
+          <w:p>
+            <w:pPr>
+              <w:pStyle w:val="Contenido"/>
+              <w:framePr w:hSpace="0" w:wrap="auto" w:vAnchor="margin" w:hAnchor="text" w:yAlign="inline"/>
+              <w:rPr>
+                <w:rFonts w:asciiTheme="majorHAnsi" w:hAnsiTheme="majorHAnsi"/>
+                <w:b/>
+                <w:sz w:val="32"/>
+                <w:szCs w:val="32"/>
+              </w:rPr>
+            </w:pPr>
+            <w:r>
+              <w:rPr>
+                <w:rFonts w:asciiTheme="majorHAnsi" w:hAnsiTheme="majorHAnsi"/>
+                <w:b/>
+                <w:sz w:val="32"/>
+                <w:szCs w:val="32"/>
+              </w:rPr>
+              <w:t>Experiments done by Meta</w:t>
+            </w:r>
+          </w:p>
+          <w:p>
+            <w:pPr>
+              <w:rPr>
+                <w:b w:val="0"/>
+                <w:bCs/>
+              </w:rPr>
+            </w:pPr>
+            <w:r>
+              <w:rPr>
+                <w:b w:val="0"/>
+                <w:bCs/>
+                <w:color w:val="auto"/>
+              </w:rPr>
+              <w:t>The</w:t>
+            </w:r>
+            <w:r>
+              <w:rPr>
+                <w:b w:val="0"/>
+                <w:bCs/>
+                <w:color w:val="auto"/>
+              </w:rPr>
+              <w:t xml:space="preserve">y made some experiments to compare the DLRM model with a </w:t>
+            </w:r>
+            <w:r>
+              <w:rPr>
+                <w:b w:val="0"/>
+                <w:bCs/>
+              </w:rPr>
+              <w:t>DCN(Deep and Cross Network)</w:t>
+            </w:r>
+            <w:r>
+              <w:rPr>
+                <w:b w:val="0"/>
+                <w:bCs/>
+              </w:rPr>
+              <w:t xml:space="preserve"> model, where </w:t>
+            </w:r>
+            <w:r>
+              <w:rPr>
+                <w:b w:val="0"/>
+                <w:bCs/>
+              </w:rPr>
+              <w:t>DLRM obtains slightly higher training and validation accuracy without extensive tuning of model hyperparameters.</w:t>
+            </w:r>
+          </w:p>
+          <w:p>
+            <w:pPr>
+              <w:rPr>
+                <w:b w:val="0"/>
+                <w:bCs/>
+              </w:rPr>
+            </w:pPr>
+            <w:r>
+              <w:rPr>
+                <w:b w:val="0"/>
+                <w:bCs/>
+                <w:i/>
+                <w:iCs/>
+              </w:rPr>
+              <w:t xml:space="preserve">Important </w:t>
+            </w:r>
+            <w:r>
+              <w:rPr>
+                <w:b w:val="0"/>
+                <w:bCs/>
+                <w:i/>
+                <w:iCs/>
+              </w:rPr>
+              <w:t>n</w:t>
+            </w:r>
+            <w:r>
+              <w:rPr>
+                <w:b w:val="0"/>
+                <w:bCs/>
+                <w:i/>
+                <w:iCs/>
+              </w:rPr>
+              <w:t>ote</w:t>
+            </w:r>
+            <w:r>
+              <w:rPr>
+                <w:b w:val="0"/>
+                <w:bCs/>
+              </w:rPr>
+              <w:t>: official GitHub’s implementations and experiments where done in a multi GPU system with a lot of memory power.</w:t>
+            </w:r>
+          </w:p>
+          <w:p>
+            <w:pPr>
+              <w:pStyle w:val="Contenido"/>
+              <w:framePr w:hSpace="0" w:wrap="auto" w:vAnchor="margin" w:hAnchor="text" w:yAlign="inline"/>
+              <w:rPr>
+                <w:rFonts w:asciiTheme="majorHAnsi" w:hAnsiTheme="majorHAnsi"/>
+                <w:b/>
+                <w:color w:val="auto"/>
+                <w:sz w:val="32"/>
+                <w:szCs w:val="32"/>
+              </w:rPr>
+            </w:pPr>
           </w:p>
           <w:p>
             <w:pPr>
@@ -1372,7 +2678,176 @@
               <w:framePr w:hSpace="0" w:wrap="auto" w:vAnchor="margin" w:hAnchor="text" w:yAlign="inline"/>
             </w:pPr>
             <w:r>
-              <w:t>Summary of dependencies</w:t>
+              <w:t xml:space="preserve">The official GitHub repositories implement the model using both Caffe2 and </w:t>
+            </w:r>
+            <w:proofErr w:type="spellStart"/>
+            <w:r>
+              <w:t>PyTorch</w:t>
+            </w:r>
+            <w:proofErr w:type="spellEnd"/>
+            <w:r>
+              <w:t xml:space="preserve"> libraries, and you can run it with either one or both.</w:t>
+            </w:r>
+          </w:p>
+          <w:p>
+            <w:pPr>
+              <w:pStyle w:val="Contenido"/>
+              <w:framePr w:hSpace="0" w:wrap="auto" w:vAnchor="margin" w:hAnchor="text" w:yAlign="inline"/>
+            </w:pPr>
+            <w:r>
+              <w:t xml:space="preserve">We chose to conduct our tests with </w:t>
+            </w:r>
+            <w:proofErr w:type="spellStart"/>
+            <w:r>
+              <w:rPr>
+                <w:b/>
+                <w:bCs/>
+              </w:rPr>
+              <w:t>PyTorch</w:t>
+            </w:r>
+            <w:proofErr w:type="spellEnd"/>
+            <w:r>
+              <w:t xml:space="preserve"> because we have previous experience working with this library. For this reason, our setup relied heavily on the </w:t>
+            </w:r>
+            <w:proofErr w:type="spellStart"/>
+            <w:r>
+              <w:rPr>
+                <w:b/>
+                <w:bCs/>
+              </w:rPr>
+              <w:t>PyTorch</w:t>
+            </w:r>
+            <w:proofErr w:type="spellEnd"/>
+            <w:r>
+              <w:rPr>
+                <w:b/>
+                <w:bCs/>
+              </w:rPr>
+              <w:t xml:space="preserve"> nightly builds</w:t>
+            </w:r>
+            <w:r>
+              <w:t xml:space="preserve">, which are necessary to access the latest features not yet available in the stable version. Additionally, we had to install some complementary </w:t>
+            </w:r>
+            <w:proofErr w:type="spellStart"/>
+            <w:r>
+              <w:t>PyTorch</w:t>
+            </w:r>
+            <w:proofErr w:type="spellEnd"/>
+            <w:r>
+              <w:t xml:space="preserve"> packages such as </w:t>
+            </w:r>
+            <w:proofErr w:type="spellStart"/>
+            <w:r>
+              <w:rPr>
+                <w:i/>
+                <w:iCs/>
+              </w:rPr>
+              <w:t>torchviz</w:t>
+            </w:r>
+            <w:proofErr w:type="spellEnd"/>
+            <w:r>
+              <w:rPr>
+                <w:i/>
+                <w:iCs/>
+              </w:rPr>
+              <w:t xml:space="preserve">, </w:t>
+            </w:r>
+            <w:proofErr w:type="spellStart"/>
+            <w:r>
+              <w:rPr>
+                <w:i/>
+                <w:iCs/>
+              </w:rPr>
+              <w:t>torchrec</w:t>
+            </w:r>
+            <w:proofErr w:type="spellEnd"/>
+            <w:r>
+              <w:rPr>
+                <w:i/>
+                <w:iCs/>
+              </w:rPr>
+              <w:t xml:space="preserve">-nightly, and </w:t>
+            </w:r>
+            <w:proofErr w:type="spellStart"/>
+            <w:r>
+              <w:rPr>
+                <w:i/>
+                <w:iCs/>
+              </w:rPr>
+              <w:t>torchx</w:t>
+            </w:r>
+            <w:proofErr w:type="spellEnd"/>
+            <w:r>
+              <w:rPr>
+                <w:i/>
+                <w:iCs/>
+              </w:rPr>
+              <w:t>-nightly</w:t>
+            </w:r>
+            <w:r>
+              <w:t xml:space="preserve">, along with some essential base libraries including </w:t>
+            </w:r>
+            <w:proofErr w:type="spellStart"/>
+            <w:r>
+              <w:rPr>
+                <w:i/>
+                <w:iCs/>
+              </w:rPr>
+              <w:t>numpy</w:t>
+            </w:r>
+            <w:proofErr w:type="spellEnd"/>
+            <w:r>
+              <w:rPr>
+                <w:i/>
+                <w:iCs/>
+              </w:rPr>
+              <w:t xml:space="preserve">, scikit-learn, </w:t>
+            </w:r>
+            <w:proofErr w:type="spellStart"/>
+            <w:r>
+              <w:rPr>
+                <w:i/>
+                <w:iCs/>
+              </w:rPr>
+              <w:t>tqdm</w:t>
+            </w:r>
+            <w:proofErr w:type="spellEnd"/>
+            <w:r>
+              <w:rPr>
+                <w:i/>
+                <w:iCs/>
+              </w:rPr>
+              <w:t xml:space="preserve">, </w:t>
+            </w:r>
+            <w:proofErr w:type="spellStart"/>
+            <w:r>
+              <w:rPr>
+                <w:i/>
+                <w:iCs/>
+              </w:rPr>
+              <w:t>pydot</w:t>
+            </w:r>
+            <w:proofErr w:type="spellEnd"/>
+            <w:r>
+              <w:t>, and others.</w:t>
+            </w:r>
+          </w:p>
+          <w:p>
+            <w:pPr>
+              <w:pStyle w:val="Contenido"/>
+              <w:framePr w:hSpace="0" w:wrap="auto" w:vAnchor="margin" w:hAnchor="text" w:yAlign="inline"/>
+            </w:pPr>
+            <w:r>
+              <w:t xml:space="preserve">All of this is powered by </w:t>
+            </w:r>
+            <w:r>
+              <w:rPr>
+                <w:u w:val="single"/>
+              </w:rPr>
+              <w:t>Python 3.10</w:t>
+            </w:r>
+            <w:r>
+              <w:t>.</w:t>
             </w:r>
           </w:p>
           <w:p>
@@ -1395,18 +2870,22 @@
               <w:framePr w:hSpace="0" w:wrap="auto" w:vAnchor="margin" w:hAnchor="text" w:yAlign="inline"/>
               <w:rPr>
                 <w:bCs/>
+                <w:highlight w:val="green"/>
               </w:rPr>
             </w:pPr>
             <w:r>
               <w:rPr>
                 <w:bCs/>
-              </w:rPr>
+                <w:highlight w:val="green"/>
+              </w:rPr>
+              <w:lastRenderedPageBreak/>
               <w:t xml:space="preserve">ERROR → The </w:t>
             </w:r>
             <w:proofErr w:type="spellStart"/>
             <w:r>
               <w:rPr>
                 <w:bCs/>
+                <w:highlight w:val="green"/>
               </w:rPr>
               <w:t>torchrec</w:t>
             </w:r>
@@ -1414,6 +2893,7 @@
             <w:r>
               <w:rPr>
                 <w:bCs/>
+                <w:highlight w:val="green"/>
               </w:rPr>
               <w:t xml:space="preserve">-nightly library depends on </w:t>
             </w:r>
@@ -1421,6 +2901,7 @@
             <w:r>
               <w:rPr>
                 <w:bCs/>
+                <w:highlight w:val="green"/>
               </w:rPr>
               <w:t>fbgemm_gpu</w:t>
             </w:r>
@@ -1428,6 +2909,7 @@
             <w:r>
               <w:rPr>
                 <w:bCs/>
+                <w:highlight w:val="green"/>
               </w:rPr>
               <w:t>, a native library that is only available on Linux, not on Windows. This library contains C++ and CUDA code that does not compile or run on Windows.</w:t>
             </w:r>
@@ -1439,6 +2921,7 @@
               <w:rPr>
                 <w:b/>
                 <w:bCs/>
+                <w:highlight w:val="green"/>
               </w:rPr>
             </w:pPr>
           </w:p>
@@ -1448,6 +2931,9 @@
               <w:framePr w:hSpace="0" w:wrap="auto" w:vAnchor="margin" w:hAnchor="text" w:yAlign="inline"/>
             </w:pPr>
             <w:r>
+              <w:rPr>
+                <w:highlight w:val="green"/>
+              </w:rPr>
               <w:t xml:space="preserve">SOLUTION → Use a Docker container with a personalized image. </w:t>
             </w:r>
             <w:r>
@@ -1456,24 +2942,16 @@
                 <w:color w:val="auto"/>
                 <w:sz w:val="24"/>
                 <w:szCs w:val="24"/>
+                <w:highlight w:val="green"/>
                 <w:lang w:eastAsia="es-ES"/>
               </w:rPr>
               <w:t xml:space="preserve"> </w:t>
             </w:r>
             <w:r>
-              <w:t>This way: You only configure it once.</w:t>
-            </w:r>
-            <w:r>
-              <w:t xml:space="preserve"> </w:t>
-            </w:r>
-            <w:r>
-              <w:t>You get a complete, reproducible, and portable environment.</w:t>
-            </w:r>
-            <w:r>
-              <w:t xml:space="preserve"> </w:t>
-            </w:r>
-            <w:r>
-              <w:t>You avoid having to manually install packages every time you run the container.</w:t>
+              <w:rPr>
+                <w:highlight w:val="green"/>
+              </w:rPr>
+              <w:t>This way: You only configure it once. You get a complete, reproducible, and portable environment. You avoid having to manually install packages every time you run the container.</w:t>
             </w:r>
           </w:p>
           <w:p>
@@ -1604,31 +3082,7 @@
               <w:sym w:font="Wingdings" w:char="F0E0"/>
             </w:r>
             <w:r>
-              <w:t xml:space="preserve"> three libraries usage come up </w:t>
-            </w:r>
-            <w:proofErr w:type="gramStart"/>
-            <w:r>
-              <w:t>later on</w:t>
-            </w:r>
-            <w:proofErr w:type="gramEnd"/>
-            <w:r>
-              <w:t xml:space="preserve"> the usage of the </w:t>
-            </w:r>
-            <w:proofErr w:type="gramStart"/>
-            <w:r>
-              <w:t>model</w:t>
-            </w:r>
-            <w:proofErr w:type="gramEnd"/>
-            <w:r>
-              <w:t xml:space="preserve"> so they </w:t>
-            </w:r>
-            <w:proofErr w:type="gramStart"/>
-            <w:r>
-              <w:t>have to</w:t>
-            </w:r>
-            <w:proofErr w:type="gramEnd"/>
-            <w:r>
-              <w:t xml:space="preserve"> be installed manually once the docker is activated: </w:t>
+              <w:t xml:space="preserve"> three libraries usage come up later on the usage of the model so they have to be installed manually once the docker is activated: </w:t>
             </w:r>
             <w:proofErr w:type="spellStart"/>
             <w:r>
@@ -1717,29 +3171,23 @@
             <w:r>
               <w:t xml:space="preserve">If you run the commands by </w:t>
             </w:r>
-            <w:proofErr w:type="gramStart"/>
-            <w:r>
-              <w:t>themselves</w:t>
-            </w:r>
-            <w:proofErr w:type="gramEnd"/>
+            <w:r>
+              <w:t>themselves,</w:t>
+            </w:r>
             <w:r>
               <w:t xml:space="preserve"> they are set up to run with random automatically generated data and with heavy settings done to be run on terminals with several </w:t>
             </w:r>
+            <w:r>
+              <w:t>GPU</w:t>
+            </w:r>
+            <w:r>
+              <w:t xml:space="preserve">s </w:t>
+            </w:r>
             <w:proofErr w:type="spellStart"/>
             <w:r>
-              <w:t>gpus</w:t>
+              <w:t>witch</w:t>
             </w:r>
             <w:proofErr w:type="spellEnd"/>
-            <w:r>
-              <w:t xml:space="preserve"> </w:t>
-            </w:r>
-            <w:proofErr w:type="spellStart"/>
-            <w:proofErr w:type="gramStart"/>
-            <w:r>
-              <w:t>witch</w:t>
-            </w:r>
-            <w:proofErr w:type="spellEnd"/>
-            <w:proofErr w:type="gramEnd"/>
             <w:r>
               <w:t xml:space="preserve"> ends up on the processes being killed as the RAM and GPU memory runs out.</w:t>
             </w:r>
@@ -1765,22 +3213,82 @@
     <w:p>
       <w:pPr>
         <w:rPr>
-          <w:b w:val="0"/>
-          <w:bCs/>
-          <w:lang w:bidi="es-ES"/>
-        </w:rPr>
-      </w:pPr>
-      <w:hyperlink r:id="rId17" w:history="1">
-        <w:r>
-          <w:rPr>
-            <w:rStyle w:val="Hyperlink"/>
-            <w:b w:val="0"/>
-            <w:bCs/>
-            <w:lang w:bidi="es-ES"/>
-          </w:rPr>
-          <w:t>Kaggle Display Advertising dataset</w:t>
-        </w:r>
-      </w:hyperlink>
+          <w:rStyle w:val="Hyperlink"/>
+        </w:rPr>
+      </w:pPr>
+      <w:r>
+        <w:rPr>
+          <w:b w:val="0"/>
+          <w:bCs/>
+          <w:lang w:bidi="es-ES"/>
+        </w:rPr>
+        <w:t xml:space="preserve">We used one of the recommended datasets on the official GitHub </w:t>
+      </w:r>
+      <w:r>
+        <w:rPr>
+          <w:b w:val="0"/>
+          <w:bCs/>
+          <w:lang w:bidi="es-ES"/>
+        </w:rPr>
+        <w:t>repository</w:t>
+      </w:r>
+      <w:r>
+        <w:rPr>
+          <w:b w:val="0"/>
+          <w:bCs/>
+          <w:lang w:bidi="es-ES"/>
+        </w:rPr>
+        <w:t xml:space="preserve">, </w:t>
+      </w:r>
+      <w:r>
+        <w:rPr>
+          <w:b w:val="0"/>
+          <w:bCs/>
+          <w:lang w:bidi="es-ES"/>
+        </w:rPr>
+        <w:fldChar w:fldCharType="begin"/>
+      </w:r>
+      <w:r>
+        <w:rPr>
+          <w:b w:val="0"/>
+          <w:bCs/>
+          <w:lang w:bidi="es-ES"/>
+        </w:rPr>
+        <w:instrText>HYPERLINK "https://www.kaggle.com/competitions/criteo-display-ad-challenge/data"</w:instrText>
+      </w:r>
+      <w:r>
+        <w:rPr>
+          <w:b w:val="0"/>
+          <w:bCs/>
+          <w:lang w:bidi="es-ES"/>
+        </w:rPr>
+      </w:r>
+      <w:r>
+        <w:rPr>
+          <w:b w:val="0"/>
+          <w:bCs/>
+          <w:lang w:bidi="es-ES"/>
+        </w:rPr>
+        <w:fldChar w:fldCharType="separate"/>
+      </w:r>
+      <w:r>
+        <w:rPr>
+          <w:rStyle w:val="Hyperlink"/>
+          <w:b w:val="0"/>
+          <w:bCs/>
+          <w:lang w:bidi="es-ES"/>
+        </w:rPr>
+        <w:t>Kaggle Display Advertising dataset</w:t>
+      </w:r>
+      <w:r>
+        <w:rPr>
+          <w:rStyle w:val="Hyperlink"/>
+          <w:b w:val="0"/>
+          <w:bCs/>
+          <w:lang w:bidi="es-ES"/>
+        </w:rPr>
+        <w:t>.</w:t>
+      </w:r>
     </w:p>
     <w:p>
       <w:pPr>
@@ -1790,13 +3298,126 @@
           <w:lang w:bidi="es-ES"/>
         </w:rPr>
       </w:pPr>
+      <w:r>
+        <w:rPr>
+          <w:b w:val="0"/>
+          <w:bCs/>
+          <w:lang w:bidi="es-ES"/>
+        </w:rPr>
+        <w:fldChar w:fldCharType="end"/>
+      </w:r>
+      <w:r>
+        <w:rPr>
+          <w:b w:val="0"/>
+          <w:bCs/>
+          <w:lang w:bidi="es-ES"/>
+        </w:rPr>
+        <w:t>The dataset consists on “</w:t>
+      </w:r>
+      <w:r>
+        <w:rPr>
+          <w:b w:val="0"/>
+          <w:bCs/>
+          <w:lang w:bidi="es-ES"/>
+        </w:rPr>
+        <w:t>a portion of Criteo's traffic over a period of 7 days. Each row corresponds to a display ad served by Criteo</w:t>
+      </w:r>
+      <w:r>
+        <w:rPr>
+          <w:b w:val="0"/>
+          <w:bCs/>
+          <w:lang w:bidi="es-ES"/>
+        </w:rPr>
+        <w:t>, the t</w:t>
+      </w:r>
+      <w:r>
+        <w:rPr>
+          <w:b w:val="0"/>
+          <w:bCs/>
+          <w:lang w:bidi="es-ES"/>
+        </w:rPr>
+        <w:t>arget variable indicates if an ad was clicked (1) or not (0)</w:t>
+      </w:r>
+      <w:r>
+        <w:rPr>
+          <w:b w:val="0"/>
+          <w:bCs/>
+          <w:lang w:bidi="es-ES"/>
+        </w:rPr>
+        <w:t>”</w:t>
+      </w:r>
+      <w:r>
+        <w:rPr>
+          <w:b w:val="0"/>
+          <w:bCs/>
+          <w:lang w:bidi="es-ES"/>
+        </w:rPr>
+        <w:t xml:space="preserve">. It has </w:t>
+      </w:r>
+      <w:r>
+        <w:rPr>
+          <w:b w:val="0"/>
+          <w:bCs/>
+          <w:lang w:bidi="es-ES"/>
+        </w:rPr>
+        <w:t>39</w:t>
+      </w:r>
+      <w:r>
+        <w:rPr>
+          <w:b w:val="0"/>
+          <w:bCs/>
+          <w:lang w:bidi="es-ES"/>
+        </w:rPr>
+        <w:t xml:space="preserve"> </w:t>
+      </w:r>
+      <w:r>
+        <w:rPr>
+          <w:b w:val="0"/>
+          <w:bCs/>
+          <w:lang w:bidi="es-ES"/>
+        </w:rPr>
+        <w:t>features/columns, 26 being categorical features and 13 being continuous features,</w:t>
+      </w:r>
+      <w:r>
+        <w:rPr>
+          <w:b w:val="0"/>
+          <w:bCs/>
+          <w:lang w:bidi="es-ES"/>
+        </w:rPr>
+        <w:t xml:space="preserve"> </w:t>
+      </w:r>
+      <w:r>
+        <w:rPr>
+          <w:b w:val="0"/>
+          <w:bCs/>
+          <w:lang w:bidi="es-ES"/>
+        </w:rPr>
+        <w:t>and around 45 million of entries.</w:t>
+      </w:r>
     </w:p>
     <w:p>
       <w:pPr>
-        <w:pStyle w:val="Heading3"/>
-      </w:pPr>
-      <w:r>
-        <w:t>DATA PREPROCESSING</w:t>
+        <w:rPr>
+          <w:b w:val="0"/>
+          <w:bCs/>
+          <w:lang w:bidi="es-ES"/>
+        </w:rPr>
+      </w:pPr>
+      <w:r>
+        <w:rPr>
+          <w:b w:val="0"/>
+          <w:bCs/>
+          <w:lang w:bidi="es-ES"/>
+        </w:rPr>
+        <w:t>Sample of the first 5 data points from the database</w:t>
+      </w:r>
+      <w:r>
+        <w:rPr>
+          <w:b w:val="0"/>
+          <w:bCs/>
+          <w:lang w:bidi="es-ES"/>
+        </w:rPr>
+        <w:t>:</w:t>
       </w:r>
     </w:p>
     <w:p>
@@ -1804,148 +3425,72 @@
         <w:rPr>
           <w:b w:val="0"/>
           <w:bCs/>
-          <w:lang w:bidi="es-ES"/>
-        </w:rPr>
-      </w:pPr>
-      <w:r>
-        <w:rPr>
-          <w:b w:val="0"/>
-          <w:bCs/>
-          <w:lang w:bidi="es-ES"/>
-        </w:rPr>
-        <w:t>I took the train.txt from the zip</w:t>
-      </w:r>
-      <w:r>
-        <w:rPr>
-          <w:b w:val="0"/>
-          <w:bCs/>
-          <w:lang w:bidi="es-ES"/>
-        </w:rPr>
-        <w:t xml:space="preserve">. </w:t>
+          <w:lang w:val="es-ES" w:bidi="es-ES"/>
+        </w:rPr>
+      </w:pPr>
+      <w:r>
+        <w:rPr>
+          <w:b w:val="0"/>
+          <w:bCs/>
+          <w:lang w:val="es-ES" w:bidi="es-ES"/>
+        </w:rPr>
+        <w:drawing>
+          <wp:inline distT="0" distB="0" distL="0" distR="0" wp14:anchorId="4E09DE2C" wp14:editId="14A338B1">
+            <wp:extent cx="6097270" cy="323215"/>
+            <wp:effectExtent l="0" t="0" r="0" b="0"/>
+            <wp:docPr id="1676222863" name="Picture 1"/>
+            <wp:cNvGraphicFramePr>
+              <a:graphicFrameLocks xmlns:a="http://schemas.openxmlformats.org/drawingml/2006/main" noChangeAspect="1"/>
+            </wp:cNvGraphicFramePr>
+            <a:graphic xmlns:a="http://schemas.openxmlformats.org/drawingml/2006/main">
+              <a:graphicData uri="http://schemas.openxmlformats.org/drawingml/2006/picture">
+                <pic:pic xmlns:pic="http://schemas.openxmlformats.org/drawingml/2006/picture">
+                  <pic:nvPicPr>
+                    <pic:cNvPr id="1676222863" name=""/>
+                    <pic:cNvPicPr/>
+                  </pic:nvPicPr>
+                  <pic:blipFill>
+                    <a:blip r:embed="rId22"/>
+                    <a:stretch>
+                      <a:fillRect/>
+                    </a:stretch>
+                  </pic:blipFill>
+                  <pic:spPr>
+                    <a:xfrm>
+                      <a:off x="0" y="0"/>
+                      <a:ext cx="6097270" cy="323215"/>
+                    </a:xfrm>
+                    <a:prstGeom prst="rect">
+                      <a:avLst/>
+                    </a:prstGeom>
+                  </pic:spPr>
+                </pic:pic>
+              </a:graphicData>
+            </a:graphic>
+          </wp:inline>
+        </w:drawing>
       </w:r>
     </w:p>
     <w:p>
       <w:pPr>
-        <w:rPr>
-          <w:b w:val="0"/>
-          <w:bCs/>
-          <w:lang w:bidi="es-ES"/>
-        </w:rPr>
-      </w:pPr>
-      <w:r>
-        <w:rPr>
-          <w:b w:val="0"/>
-          <w:bCs/>
-          <w:lang w:bidi="es-ES"/>
-        </w:rPr>
-        <w:t>Data must undergo a preprocessing to being able to enter the model.</w:t>
-      </w:r>
+        <w:pStyle w:val="Heading3"/>
+        <w:rPr>
+          <w:lang w:val="es-ES"/>
+        </w:rPr>
+      </w:pPr>
     </w:p>
     <w:p>
       <w:pPr>
-        <w:rPr>
-          <w:b w:val="0"/>
-          <w:bCs/>
-          <w:lang w:bidi="es-ES"/>
-        </w:rPr>
-      </w:pPr>
-      <w:r>
-        <w:rPr>
-          <w:b w:val="0"/>
-          <w:bCs/>
-          <w:lang w:bidi="es-ES"/>
-        </w:rPr>
-        <w:t xml:space="preserve">The </w:t>
-      </w:r>
-      <w:proofErr w:type="spellStart"/>
-      <w:r>
-        <w:rPr>
-          <w:b w:val="0"/>
-          <w:bCs/>
-          <w:lang w:bidi="es-ES"/>
-        </w:rPr>
-        <w:t>procecess</w:t>
-      </w:r>
-      <w:proofErr w:type="spellEnd"/>
-      <w:r>
-        <w:rPr>
-          <w:b w:val="0"/>
-          <w:bCs/>
-          <w:lang w:bidi="es-ES"/>
-        </w:rPr>
-        <w:t xml:space="preserve"> splits the data on “days” and process each day </w:t>
-      </w:r>
-      <w:proofErr w:type="spellStart"/>
-      <w:r>
-        <w:rPr>
-          <w:b w:val="0"/>
-          <w:bCs/>
-          <w:lang w:bidi="es-ES"/>
-        </w:rPr>
-        <w:t>separatlly</w:t>
-      </w:r>
-      <w:proofErr w:type="spellEnd"/>
-      <w:r>
-        <w:rPr>
-          <w:b w:val="0"/>
-          <w:bCs/>
-          <w:lang w:bidi="es-ES"/>
-        </w:rPr>
-        <w:t xml:space="preserve">, the program reads all the dataset and then divides the data equally among the days, and each day has a minimum amount of data approximately 1,28 millions of entries, it loads each split, reads all its entries saving also which entries are labelled as 1 and 0, and then stored in files as </w:t>
-      </w:r>
-      <w:proofErr w:type="spellStart"/>
-      <w:r>
-        <w:rPr>
-          <w:b w:val="0"/>
-          <w:bCs/>
-          <w:lang w:bidi="es-ES"/>
-        </w:rPr>
-        <w:t>train_day_X.npz</w:t>
-      </w:r>
-      <w:proofErr w:type="spellEnd"/>
-      <w:r>
-        <w:rPr>
-          <w:b w:val="0"/>
-          <w:bCs/>
-          <w:lang w:bidi="es-ES"/>
-        </w:rPr>
-        <w:t xml:space="preserve">, at the end of the process the program take all this generated sub-files and converge all of them in a general file named </w:t>
-      </w:r>
-      <w:proofErr w:type="spellStart"/>
-      <w:r>
-        <w:rPr>
-          <w:b w:val="0"/>
-          <w:bCs/>
-          <w:lang w:bidi="es-ES"/>
-        </w:rPr>
-        <w:t>kaggleAdDisplayChallenge_processed.npz</w:t>
-      </w:r>
-      <w:proofErr w:type="spellEnd"/>
-      <w:r>
-        <w:rPr>
-          <w:b w:val="0"/>
-          <w:bCs/>
-          <w:lang w:bidi="es-ES"/>
-        </w:rPr>
-        <w:t xml:space="preserve">. I did the preprocessing of the 45 million data entries (I think it was this value I didn’t check), </w:t>
-      </w:r>
-      <w:proofErr w:type="spellStart"/>
-      <w:r>
-        <w:rPr>
-          <w:b w:val="0"/>
-          <w:bCs/>
-          <w:lang w:bidi="es-ES"/>
-        </w:rPr>
-        <w:t>wich</w:t>
-      </w:r>
-      <w:proofErr w:type="spellEnd"/>
-      <w:r>
-        <w:rPr>
-          <w:b w:val="0"/>
-          <w:bCs/>
-          <w:lang w:bidi="es-ES"/>
-        </w:rPr>
-        <w:t xml:space="preserve"> took 12 hours for the process to be killed when the program wanted to concatenate all the splits for making a final all-together file.</w:t>
+        <w:pStyle w:val="Heading3"/>
+        <w:rPr>
+          <w:lang w:val="es-ES"/>
+        </w:rPr>
+      </w:pPr>
+      <w:r>
+        <w:rPr>
+          <w:lang w:val="es-ES"/>
+        </w:rPr>
+        <w:t>DATA PREPROCESSING</w:t>
       </w:r>
     </w:p>
     <w:p>
@@ -1956,66 +3501,22 @@
           <w:lang w:bidi="es-ES"/>
         </w:rPr>
       </w:pPr>
-      <w:proofErr w:type="gramStart"/>
-      <w:r>
-        <w:rPr>
-          <w:b w:val="0"/>
-          <w:bCs/>
-          <w:lang w:bidi="es-ES"/>
-        </w:rPr>
-        <w:t>So</w:t>
-      </w:r>
-      <w:proofErr w:type="gramEnd"/>
-      <w:r>
-        <w:rPr>
-          <w:b w:val="0"/>
-          <w:bCs/>
-          <w:lang w:bidi="es-ES"/>
-        </w:rPr>
-        <w:t xml:space="preserve"> after many </w:t>
-      </w:r>
-      <w:proofErr w:type="gramStart"/>
-      <w:r>
-        <w:rPr>
-          <w:b w:val="0"/>
-          <w:bCs/>
-          <w:lang w:bidi="es-ES"/>
-        </w:rPr>
-        <w:t>tries</w:t>
-      </w:r>
-      <w:proofErr w:type="gramEnd"/>
-      <w:r>
-        <w:rPr>
-          <w:b w:val="0"/>
-          <w:bCs/>
-          <w:lang w:bidi="es-ES"/>
-        </w:rPr>
-        <w:t xml:space="preserve"> I discovered that the training has a minimum </w:t>
-      </w:r>
-      <w:proofErr w:type="gramStart"/>
-      <w:r>
-        <w:rPr>
-          <w:b w:val="0"/>
-          <w:bCs/>
-          <w:lang w:bidi="es-ES"/>
-        </w:rPr>
-        <w:t>amount</w:t>
-      </w:r>
-      <w:proofErr w:type="gramEnd"/>
-      <w:r>
-        <w:rPr>
-          <w:b w:val="0"/>
-          <w:bCs/>
-          <w:lang w:bidi="es-ES"/>
-        </w:rPr>
-        <w:t xml:space="preserve"> of “days” to be able to conclude with out errors, which is 7 so, </w:t>
-      </w:r>
-      <w:r>
-        <w:rPr>
-          <w:b w:val="0"/>
-          <w:lang w:bidi="es-ES"/>
-        </w:rPr>
-        <w:t>I sampled 9 million entries from train.txt (using a head from the train.txt and redirecting it to another txt file), which is roughly the minimum required to cover 7 days.</w:t>
+      <w:r>
+        <w:rPr>
+          <w:b w:val="0"/>
+          <w:bCs/>
+          <w:lang w:bidi="es-ES"/>
+        </w:rPr>
+        <w:lastRenderedPageBreak/>
+        <w:t>I took the train.txt from the zip</w:t>
+      </w:r>
+      <w:r>
+        <w:rPr>
+          <w:b w:val="0"/>
+          <w:bCs/>
+          <w:lang w:bidi="es-ES"/>
+        </w:rPr>
+        <w:t xml:space="preserve">. </w:t>
       </w:r>
     </w:p>
     <w:p>
@@ -2032,25 +3533,167 @@
           <w:bCs/>
           <w:lang w:bidi="es-ES"/>
         </w:rPr>
-        <w:t xml:space="preserve">To run the </w:t>
-      </w:r>
-      <w:proofErr w:type="gramStart"/>
-      <w:r>
-        <w:rPr>
-          <w:b w:val="0"/>
-          <w:bCs/>
-          <w:lang w:bidi="es-ES"/>
-        </w:rPr>
-        <w:t>preprocess</w:t>
-      </w:r>
-      <w:proofErr w:type="gramEnd"/>
-      <w:r>
-        <w:rPr>
-          <w:b w:val="0"/>
-          <w:bCs/>
-          <w:lang w:bidi="es-ES"/>
-        </w:rPr>
-        <w:t xml:space="preserve"> you must enter in the bash</w:t>
+        <w:t>Data must undergo a preprocessing to being able to enter the model.</w:t>
+      </w:r>
+    </w:p>
+    <w:p>
+      <w:pPr>
+        <w:rPr>
+          <w:b w:val="0"/>
+          <w:bCs/>
+          <w:lang w:bidi="es-ES"/>
+        </w:rPr>
+      </w:pPr>
+      <w:r>
+        <w:rPr>
+          <w:b w:val="0"/>
+          <w:bCs/>
+          <w:lang w:bidi="es-ES"/>
+        </w:rPr>
+        <w:t xml:space="preserve">The </w:t>
+      </w:r>
+      <w:r>
+        <w:rPr>
+          <w:b w:val="0"/>
+          <w:bCs/>
+          <w:lang w:bidi="es-ES"/>
+        </w:rPr>
+        <w:t>processes</w:t>
+      </w:r>
+      <w:r>
+        <w:rPr>
+          <w:b w:val="0"/>
+          <w:bCs/>
+          <w:lang w:bidi="es-ES"/>
+        </w:rPr>
+        <w:t xml:space="preserve"> splits the data on “days” and process each day </w:t>
+      </w:r>
+      <w:r>
+        <w:rPr>
+          <w:b w:val="0"/>
+          <w:bCs/>
+          <w:lang w:bidi="es-ES"/>
+        </w:rPr>
+        <w:t>separately</w:t>
+      </w:r>
+      <w:r>
+        <w:rPr>
+          <w:b w:val="0"/>
+          <w:bCs/>
+          <w:lang w:bidi="es-ES"/>
+        </w:rPr>
+        <w:t xml:space="preserve">, the program reads all the dataset and then divides the data equally among the days, and each day has a minimum amount of data approximately 1,28 millions of entries, it loads each split, reads all its entries saving also which entries are labelled as 1 and 0, and then stored in files as </w:t>
+      </w:r>
+      <w:proofErr w:type="spellStart"/>
+      <w:r>
+        <w:rPr>
+          <w:b w:val="0"/>
+          <w:bCs/>
+          <w:lang w:bidi="es-ES"/>
+        </w:rPr>
+        <w:t>train_day_X.npz</w:t>
+      </w:r>
+      <w:proofErr w:type="spellEnd"/>
+      <w:r>
+        <w:rPr>
+          <w:b w:val="0"/>
+          <w:bCs/>
+          <w:lang w:bidi="es-ES"/>
+        </w:rPr>
+        <w:t xml:space="preserve">, at the end of the process the program take all this generated sub-files and converge all of them in a general file named </w:t>
+      </w:r>
+      <w:proofErr w:type="spellStart"/>
+      <w:r>
+        <w:rPr>
+          <w:b w:val="0"/>
+          <w:bCs/>
+          <w:lang w:bidi="es-ES"/>
+        </w:rPr>
+        <w:t>kaggleAdDisplayChallenge_processed.npz</w:t>
+      </w:r>
+      <w:proofErr w:type="spellEnd"/>
+      <w:r>
+        <w:rPr>
+          <w:b w:val="0"/>
+          <w:bCs/>
+          <w:lang w:bidi="es-ES"/>
+        </w:rPr>
+        <w:t xml:space="preserve">. I did the preprocessing of the 45 million data entries (I think it was this value I didn’t check), </w:t>
+      </w:r>
+      <w:proofErr w:type="spellStart"/>
+      <w:r>
+        <w:rPr>
+          <w:b w:val="0"/>
+          <w:bCs/>
+          <w:lang w:bidi="es-ES"/>
+        </w:rPr>
+        <w:t>wich</w:t>
+      </w:r>
+      <w:proofErr w:type="spellEnd"/>
+      <w:r>
+        <w:rPr>
+          <w:b w:val="0"/>
+          <w:bCs/>
+          <w:lang w:bidi="es-ES"/>
+        </w:rPr>
+        <w:t xml:space="preserve"> took 12 hours for the process to be killed when the program wanted to concatenate all the splits for making a final all-together file.</w:t>
+      </w:r>
+    </w:p>
+    <w:p>
+      <w:pPr>
+        <w:rPr>
+          <w:b w:val="0"/>
+          <w:bCs/>
+          <w:lang w:bidi="es-ES"/>
+        </w:rPr>
+      </w:pPr>
+      <w:r>
+        <w:rPr>
+          <w:b w:val="0"/>
+          <w:bCs/>
+          <w:lang w:bidi="es-ES"/>
+        </w:rPr>
+        <w:t xml:space="preserve">So after many </w:t>
+      </w:r>
+      <w:r>
+        <w:rPr>
+          <w:b w:val="0"/>
+          <w:bCs/>
+          <w:lang w:bidi="es-ES"/>
+        </w:rPr>
+        <w:t>tries,</w:t>
+      </w:r>
+      <w:r>
+        <w:rPr>
+          <w:b w:val="0"/>
+          <w:bCs/>
+          <w:lang w:bidi="es-ES"/>
+        </w:rPr>
+        <w:t xml:space="preserve"> I discovered that the training has a minimum amount of “days” to be able to conclude with out errors, which is 7 so, </w:t>
+      </w:r>
+      <w:r>
+        <w:rPr>
+          <w:b w:val="0"/>
+          <w:lang w:bidi="es-ES"/>
+        </w:rPr>
+        <w:t>I sampled 9 million entries from train.txt (using a head from the train.txt and redirecting it to another txt file), which is roughly the minimum required to cover 7 days.</w:t>
+      </w:r>
+    </w:p>
+    <w:p>
+      <w:pPr>
+        <w:rPr>
+          <w:b w:val="0"/>
+          <w:bCs/>
+          <w:lang w:bidi="es-ES"/>
+        </w:rPr>
+      </w:pPr>
+      <w:r>
+        <w:rPr>
+          <w:b w:val="0"/>
+          <w:bCs/>
+          <w:lang w:bidi="es-ES"/>
+        </w:rPr>
+        <w:t>To run the preprocess you must enter in the bash</w:t>
       </w:r>
       <w:r>
         <w:rPr>
@@ -2199,7 +3842,6 @@
         </w:rPr>
       </w:pPr>
       <w:proofErr w:type="spellStart"/>
-      <w:proofErr w:type="gramStart"/>
       <w:r>
         <w:rPr>
           <w:b w:val="0"/>
@@ -2219,7 +3861,6 @@
         </w:rPr>
         <w:t>(</w:t>
       </w:r>
-      <w:proofErr w:type="gramEnd"/>
     </w:p>
     <w:p>
       <w:pPr>
@@ -2432,6 +4073,103 @@
           <w:color w:val="92D050"/>
           <w:lang w:bidi="es-ES"/>
         </w:rPr>
+        <w:t>    </w:t>
+      </w:r>
+      <w:proofErr w:type="spellStart"/>
+      <w:r>
+        <w:rPr>
+          <w:b w:val="0"/>
+          <w:bCs/>
+          <w:color w:val="92D050"/>
+          <w:lang w:bidi="es-ES"/>
+        </w:rPr>
+        <w:t>data_split</w:t>
+      </w:r>
+      <w:proofErr w:type="spellEnd"/>
+      <w:r>
+        <w:rPr>
+          <w:b w:val="0"/>
+          <w:bCs/>
+          <w:color w:val="92D050"/>
+          <w:lang w:bidi="es-ES"/>
+        </w:rPr>
+        <w:t>='train',</w:t>
+      </w:r>
+    </w:p>
+    <w:p>
+      <w:pPr>
+        <w:rPr>
+          <w:b w:val="0"/>
+          <w:bCs/>
+          <w:color w:val="92D050"/>
+          <w:lang w:bidi="es-ES"/>
+        </w:rPr>
+      </w:pPr>
+      <w:r>
+        <w:rPr>
+          <w:b w:val="0"/>
+          <w:bCs/>
+          <w:color w:val="92D050"/>
+          <w:lang w:bidi="es-ES"/>
+        </w:rPr>
+        <w:t>    randomize='total',</w:t>
+      </w:r>
+    </w:p>
+    <w:p>
+      <w:pPr>
+        <w:rPr>
+          <w:b w:val="0"/>
+          <w:bCs/>
+          <w:color w:val="92D050"/>
+          <w:lang w:bidi="es-ES"/>
+        </w:rPr>
+      </w:pPr>
+      <w:r>
+        <w:rPr>
+          <w:b w:val="0"/>
+          <w:bCs/>
+          <w:color w:val="92D050"/>
+          <w:lang w:bidi="es-ES"/>
+        </w:rPr>
+        <w:t>    </w:t>
+      </w:r>
+      <w:proofErr w:type="spellStart"/>
+      <w:r>
+        <w:rPr>
+          <w:b w:val="0"/>
+          <w:bCs/>
+          <w:color w:val="92D050"/>
+          <w:lang w:bidi="es-ES"/>
+        </w:rPr>
+        <w:t>criteo_kaggle</w:t>
+      </w:r>
+      <w:proofErr w:type="spellEnd"/>
+      <w:r>
+        <w:rPr>
+          <w:b w:val="0"/>
+          <w:bCs/>
+          <w:color w:val="92D050"/>
+          <w:lang w:bidi="es-ES"/>
+        </w:rPr>
+        <w:t>=True,</w:t>
+      </w:r>
+    </w:p>
+    <w:p>
+      <w:pPr>
+        <w:rPr>
+          <w:b w:val="0"/>
+          <w:bCs/>
+          <w:color w:val="92D050"/>
+          <w:lang w:bidi="es-ES"/>
+        </w:rPr>
+      </w:pPr>
+      <w:r>
+        <w:rPr>
+          <w:b w:val="0"/>
+          <w:bCs/>
+          <w:color w:val="92D050"/>
+          <w:lang w:bidi="es-ES"/>
+        </w:rPr>
         <w:lastRenderedPageBreak/>
         <w:t>    </w:t>
       </w:r>
@@ -2443,7 +4181,7 @@
           <w:color w:val="92D050"/>
           <w:lang w:bidi="es-ES"/>
         </w:rPr>
-        <w:t>data_split</w:t>
+        <w:t>memory_map</w:t>
       </w:r>
       <w:proofErr w:type="spellEnd"/>
       <w:r>
@@ -2453,7 +4191,7 @@
           <w:color w:val="92D050"/>
           <w:lang w:bidi="es-ES"/>
         </w:rPr>
-        <w:t>='train',</w:t>
+        <w:t>=False</w:t>
       </w:r>
     </w:p>
     <w:p>
@@ -2472,85 +4210,22 @@
           <w:color w:val="92D050"/>
           <w:lang w:bidi="es-ES"/>
         </w:rPr>
-        <w:t>    randomize='total',</w:t>
+        <w:t>)</w:t>
       </w:r>
     </w:p>
     <w:p>
       <w:pPr>
         <w:rPr>
-          <w:b w:val="0"/>
-          <w:bCs/>
-          <w:color w:val="92D050"/>
-          <w:lang w:bidi="es-ES"/>
-        </w:rPr>
-      </w:pPr>
-      <w:r>
-        <w:rPr>
-          <w:b w:val="0"/>
-          <w:bCs/>
-          <w:color w:val="92D050"/>
-          <w:lang w:bidi="es-ES"/>
-        </w:rPr>
-        <w:t>    </w:t>
-      </w:r>
-      <w:proofErr w:type="spellStart"/>
-      <w:r>
-        <w:rPr>
-          <w:b w:val="0"/>
-          <w:bCs/>
-          <w:color w:val="92D050"/>
-          <w:lang w:bidi="es-ES"/>
-        </w:rPr>
-        <w:t>criteo_kaggle</w:t>
-      </w:r>
-      <w:proofErr w:type="spellEnd"/>
-      <w:r>
-        <w:rPr>
-          <w:b w:val="0"/>
-          <w:bCs/>
-          <w:color w:val="92D050"/>
-          <w:lang w:bidi="es-ES"/>
-        </w:rPr>
-        <w:t>=True,</w:t>
-      </w:r>
+          <w:lang w:bidi="es-ES"/>
+        </w:rPr>
+      </w:pPr>
     </w:p>
     <w:p>
       <w:pPr>
-        <w:rPr>
-          <w:b w:val="0"/>
-          <w:bCs/>
-          <w:color w:val="92D050"/>
-          <w:lang w:bidi="es-ES"/>
-        </w:rPr>
-      </w:pPr>
-      <w:r>
-        <w:rPr>
-          <w:b w:val="0"/>
-          <w:bCs/>
-          <w:color w:val="92D050"/>
-          <w:lang w:bidi="es-ES"/>
-        </w:rPr>
-        <w:t>    </w:t>
-      </w:r>
-      <w:proofErr w:type="spellStart"/>
-      <w:r>
-        <w:rPr>
-          <w:b w:val="0"/>
-          <w:bCs/>
-          <w:color w:val="92D050"/>
-          <w:lang w:bidi="es-ES"/>
-        </w:rPr>
-        <w:t>memory_map</w:t>
-      </w:r>
-      <w:proofErr w:type="spellEnd"/>
-      <w:r>
-        <w:rPr>
-          <w:b w:val="0"/>
-          <w:bCs/>
-          <w:color w:val="92D050"/>
-          <w:lang w:bidi="es-ES"/>
-        </w:rPr>
-        <w:t>=False</w:t>
+        <w:pStyle w:val="Heading3"/>
+      </w:pPr>
+      <w:r>
+        <w:t>TRAINIG</w:t>
       </w:r>
     </w:p>
     <w:p>
@@ -2558,33 +4233,60 @@
         <w:rPr>
           <w:b w:val="0"/>
           <w:bCs/>
-          <w:color w:val="92D050"/>
-          <w:lang w:bidi="es-ES"/>
-        </w:rPr>
-      </w:pPr>
-      <w:r>
-        <w:rPr>
-          <w:b w:val="0"/>
-          <w:bCs/>
-          <w:color w:val="92D050"/>
-          <w:lang w:bidi="es-ES"/>
-        </w:rPr>
-        <w:t>)</w:t>
+          <w:lang w:bidi="es-ES"/>
+        </w:rPr>
+      </w:pPr>
+      <w:r>
+        <w:rPr>
+          <w:b w:val="0"/>
+          <w:bCs/>
+          <w:lang w:bidi="es-ES"/>
+        </w:rPr>
+        <w:t>As said before the model was extremely heavy, I did so many tries all ending on the killing of the process. On the command used to execute the training all the “light” parameters can be seen:</w:t>
       </w:r>
     </w:p>
     <w:p>
       <w:pPr>
         <w:rPr>
+          <w:b w:val="0"/>
+          <w:bCs/>
           <w:lang w:bidi="es-ES"/>
         </w:rPr>
       </w:pPr>
     </w:p>
     <w:p>
       <w:pPr>
-        <w:pStyle w:val="Heading3"/>
-      </w:pPr>
-      <w:r>
-        <w:t>TRAINIG</w:t>
+        <w:rPr>
+          <w:b w:val="0"/>
+          <w:bCs/>
+          <w:color w:val="92D050"/>
+          <w:lang w:bidi="es-ES"/>
+        </w:rPr>
+      </w:pPr>
+      <w:r>
+        <w:rPr>
+          <w:b w:val="0"/>
+          <w:bCs/>
+          <w:color w:val="92D050"/>
+          <w:lang w:bidi="es-ES"/>
+        </w:rPr>
+        <w:t xml:space="preserve">python </w:t>
+      </w:r>
+      <w:r>
+        <w:rPr>
+          <w:color w:val="92D050"/>
+          <w:lang w:bidi="es-ES"/>
+        </w:rPr>
+        <w:t>dlrm_s_pytorch.py</w:t>
+      </w:r>
+      <w:r>
+        <w:rPr>
+          <w:b w:val="0"/>
+          <w:bCs/>
+          <w:color w:val="92D050"/>
+          <w:lang w:bidi="es-ES"/>
+        </w:rPr>
+        <w:t xml:space="preserve"> \</w:t>
       </w:r>
     </w:p>
     <w:p>
@@ -2592,16 +4294,18 @@
         <w:rPr>
           <w:b w:val="0"/>
           <w:bCs/>
-          <w:lang w:bidi="es-ES"/>
-        </w:rPr>
-      </w:pPr>
-      <w:r>
-        <w:rPr>
-          <w:b w:val="0"/>
-          <w:bCs/>
-          <w:lang w:bidi="es-ES"/>
-        </w:rPr>
-        <w:t>As said before the model was extremely heavy, I did so many tries all ending on the killing of the process. On the command used to execute the training all the “light” parameters can be seen:</w:t>
+          <w:color w:val="92D050"/>
+          <w:lang w:bidi="es-ES"/>
+        </w:rPr>
+      </w:pPr>
+      <w:r>
+        <w:rPr>
+          <w:b w:val="0"/>
+          <w:bCs/>
+          <w:color w:val="92D050"/>
+          <w:lang w:bidi="es-ES"/>
+        </w:rPr>
+        <w:t>  --arch-sparse-feature-size=8 \</w:t>
       </w:r>
     </w:p>
     <w:p>
@@ -2609,9 +4313,39 @@
         <w:rPr>
           <w:b w:val="0"/>
           <w:bCs/>
-          <w:lang w:bidi="es-ES"/>
-        </w:rPr>
-      </w:pPr>
+          <w:color w:val="92D050"/>
+          <w:lang w:bidi="es-ES"/>
+        </w:rPr>
+      </w:pPr>
+      <w:r>
+        <w:rPr>
+          <w:b w:val="0"/>
+          <w:bCs/>
+          <w:color w:val="92D050"/>
+          <w:lang w:bidi="es-ES"/>
+        </w:rPr>
+        <w:t>  --arch-</w:t>
+      </w:r>
+      <w:proofErr w:type="spellStart"/>
+      <w:r>
+        <w:rPr>
+          <w:b w:val="0"/>
+          <w:bCs/>
+          <w:color w:val="92D050"/>
+          <w:lang w:bidi="es-ES"/>
+        </w:rPr>
+        <w:t>mlp</w:t>
+      </w:r>
+      <w:proofErr w:type="spellEnd"/>
+      <w:r>
+        <w:rPr>
+          <w:b w:val="0"/>
+          <w:bCs/>
+          <w:color w:val="92D050"/>
+          <w:lang w:bidi="es-ES"/>
+        </w:rPr>
+        <w:t>-bot="13-8-8" \</w:t>
+      </w:r>
     </w:p>
     <w:p>
       <w:pPr>
@@ -2629,15 +4363,19 @@
           <w:color w:val="92D050"/>
           <w:lang w:bidi="es-ES"/>
         </w:rPr>
-        <w:t xml:space="preserve">python </w:t>
-      </w:r>
-      <w:r>
-        <w:rPr>
+        <w:t>  --arch-</w:t>
+      </w:r>
+      <w:proofErr w:type="spellStart"/>
+      <w:r>
+        <w:rPr>
+          <w:b w:val="0"/>
+          <w:bCs/>
           <w:color w:val="92D050"/>
           <w:lang w:bidi="es-ES"/>
         </w:rPr>
-        <w:t>dlrm_s_pytorch.py</w:t>
-      </w:r>
+        <w:t>mlp</w:t>
+      </w:r>
+      <w:proofErr w:type="spellEnd"/>
       <w:r>
         <w:rPr>
           <w:b w:val="0"/>
@@ -2645,7 +4383,7 @@
           <w:color w:val="92D050"/>
           <w:lang w:bidi="es-ES"/>
         </w:rPr>
-        <w:t xml:space="preserve"> \</w:t>
+        <w:t>-top="8-4-1" \</w:t>
       </w:r>
     </w:p>
     <w:p>
@@ -2664,7 +4402,7 @@
           <w:color w:val="92D050"/>
           <w:lang w:bidi="es-ES"/>
         </w:rPr>
-        <w:t>  --arch-sparse-feature-size=8 \</w:t>
+        <w:t>  --data-generation=dataset \</w:t>
       </w:r>
     </w:p>
     <w:p>
@@ -2683,124 +4421,7 @@
           <w:color w:val="92D050"/>
           <w:lang w:bidi="es-ES"/>
         </w:rPr>
-        <w:t>  --arch-</w:t>
-      </w:r>
-      <w:proofErr w:type="spellStart"/>
-      <w:r>
-        <w:rPr>
-          <w:b w:val="0"/>
-          <w:bCs/>
-          <w:color w:val="92D050"/>
-          <w:lang w:bidi="es-ES"/>
-        </w:rPr>
-        <w:t>mlp</w:t>
-      </w:r>
-      <w:proofErr w:type="spellEnd"/>
-      <w:r>
-        <w:rPr>
-          <w:b w:val="0"/>
-          <w:bCs/>
-          <w:color w:val="92D050"/>
-          <w:lang w:bidi="es-ES"/>
-        </w:rPr>
-        <w:t>-bot="13-8-8" \</w:t>
-      </w:r>
-    </w:p>
-    <w:p>
-      <w:pPr>
-        <w:rPr>
-          <w:b w:val="0"/>
-          <w:bCs/>
-          <w:color w:val="92D050"/>
-          <w:lang w:bidi="es-ES"/>
-        </w:rPr>
-      </w:pPr>
-      <w:r>
-        <w:rPr>
-          <w:b w:val="0"/>
-          <w:bCs/>
-          <w:color w:val="92D050"/>
-          <w:lang w:bidi="es-ES"/>
-        </w:rPr>
-        <w:t>  --arch-</w:t>
-      </w:r>
-      <w:proofErr w:type="spellStart"/>
-      <w:r>
-        <w:rPr>
-          <w:b w:val="0"/>
-          <w:bCs/>
-          <w:color w:val="92D050"/>
-          <w:lang w:bidi="es-ES"/>
-        </w:rPr>
-        <w:t>mlp</w:t>
-      </w:r>
-      <w:proofErr w:type="spellEnd"/>
-      <w:r>
-        <w:rPr>
-          <w:b w:val="0"/>
-          <w:bCs/>
-          <w:color w:val="92D050"/>
-          <w:lang w:bidi="es-ES"/>
-        </w:rPr>
-        <w:t>-top="8-4-1" \</w:t>
-      </w:r>
-    </w:p>
-    <w:p>
-      <w:pPr>
-        <w:rPr>
-          <w:b w:val="0"/>
-          <w:bCs/>
-          <w:color w:val="92D050"/>
-          <w:lang w:bidi="es-ES"/>
-        </w:rPr>
-      </w:pPr>
-      <w:r>
-        <w:rPr>
-          <w:b w:val="0"/>
-          <w:bCs/>
-          <w:color w:val="92D050"/>
-          <w:lang w:bidi="es-ES"/>
-        </w:rPr>
-        <w:t>  --data-generation=dataset \</w:t>
-      </w:r>
-    </w:p>
-    <w:p>
-      <w:pPr>
-        <w:rPr>
-          <w:b w:val="0"/>
-          <w:bCs/>
-          <w:color w:val="92D050"/>
-          <w:lang w:bidi="es-ES"/>
-        </w:rPr>
-      </w:pPr>
-      <w:r>
-        <w:rPr>
-          <w:b w:val="0"/>
-          <w:bCs/>
-          <w:color w:val="92D050"/>
-          <w:lang w:bidi="es-ES"/>
-        </w:rPr>
-        <w:t>  --</w:t>
-      </w:r>
-      <w:proofErr w:type="gramStart"/>
-      <w:r>
-        <w:rPr>
-          <w:b w:val="0"/>
-          <w:bCs/>
-          <w:color w:val="92D050"/>
-          <w:lang w:bidi="es-ES"/>
-        </w:rPr>
-        <w:t>data-set</w:t>
-      </w:r>
-      <w:proofErr w:type="gramEnd"/>
-      <w:r>
-        <w:rPr>
-          <w:b w:val="0"/>
-          <w:bCs/>
-          <w:color w:val="92D050"/>
-          <w:lang w:bidi="es-ES"/>
-        </w:rPr>
-        <w:t>=</w:t>
+        <w:t>  --data-set=</w:t>
       </w:r>
       <w:proofErr w:type="spellStart"/>
       <w:r>
@@ -3200,7 +4821,6 @@
         <w:rPr>
           <w:lang w:bidi="es-ES"/>
         </w:rPr>
-        <w:lastRenderedPageBreak/>
         <w:t>Important note:</w:t>
       </w:r>
       <w:r>
@@ -3280,6 +4900,7 @@
           <w:szCs w:val="20"/>
           <w:lang w:bidi="es-ES"/>
         </w:rPr>
+        <w:lastRenderedPageBreak/>
         <w:t>Using CPU...</w:t>
       </w:r>
     </w:p>
@@ -3934,25 +5555,7 @@
           <w:bCs/>
           <w:lang w:bidi="es-ES"/>
         </w:rPr>
-        <w:t xml:space="preserve">For performing the </w:t>
-      </w:r>
-      <w:proofErr w:type="gramStart"/>
-      <w:r>
-        <w:rPr>
-          <w:b w:val="0"/>
-          <w:bCs/>
-          <w:lang w:bidi="es-ES"/>
-        </w:rPr>
-        <w:t>benchmarking</w:t>
-      </w:r>
-      <w:proofErr w:type="gramEnd"/>
-      <w:r>
-        <w:rPr>
-          <w:b w:val="0"/>
-          <w:bCs/>
-          <w:lang w:bidi="es-ES"/>
-        </w:rPr>
-        <w:t xml:space="preserve"> we use the code specifically for this </w:t>
+        <w:t xml:space="preserve">For performing the benchmarking we use the code specifically for this </w:t>
       </w:r>
       <w:proofErr w:type="spellStart"/>
       <w:r>
@@ -4004,43 +5607,7 @@
           <w:bCs/>
           <w:lang w:bidi="es-ES"/>
         </w:rPr>
-        <w:t xml:space="preserve">The output files </w:t>
-      </w:r>
-      <w:proofErr w:type="gramStart"/>
-      <w:r>
-        <w:rPr>
-          <w:b w:val="0"/>
-          <w:bCs/>
-          <w:lang w:bidi="es-ES"/>
-        </w:rPr>
-        <w:t>consists</w:t>
-      </w:r>
-      <w:proofErr w:type="gramEnd"/>
-      <w:r>
-        <w:rPr>
-          <w:b w:val="0"/>
-          <w:bCs/>
-          <w:lang w:bidi="es-ES"/>
-        </w:rPr>
-        <w:t xml:space="preserve"> </w:t>
-      </w:r>
-      <w:proofErr w:type="gramStart"/>
-      <w:r>
-        <w:rPr>
-          <w:b w:val="0"/>
-          <w:bCs/>
-          <w:lang w:bidi="es-ES"/>
-        </w:rPr>
-        <w:t>on</w:t>
-      </w:r>
-      <w:proofErr w:type="gramEnd"/>
-      <w:r>
-        <w:rPr>
-          <w:b w:val="0"/>
-          <w:bCs/>
-          <w:lang w:bidi="es-ES"/>
-        </w:rPr>
-        <w:t>:</w:t>
+        <w:t>The output files consists on:</w:t>
       </w:r>
     </w:p>
     <w:p>
@@ -4051,7 +5618,6 @@
           <w:lang w:bidi="es-ES"/>
         </w:rPr>
       </w:pPr>
-      <w:proofErr w:type="gramStart"/>
       <w:r>
         <w:rPr>
           <w:b w:val="0"/>
@@ -4070,7 +5636,6 @@
         <w:t>json</w:t>
       </w:r>
       <w:proofErr w:type="spellEnd"/>
-      <w:proofErr w:type="gramEnd"/>
       <w:r>
         <w:rPr>
           <w:b w:val="0"/>
@@ -4131,7 +5696,6 @@
           <w:bCs/>
           <w:lang w:bidi="es-ES"/>
         </w:rPr>
-        <w:lastRenderedPageBreak/>
         <w:t xml:space="preserve">Two </w:t>
       </w:r>
       <w:r>
@@ -4257,7 +5821,7 @@
         </w:rPr>
         <w:t xml:space="preserve">It can be visualized in: </w:t>
       </w:r>
-      <w:hyperlink r:id="rId18" w:history="1">
+      <w:hyperlink r:id="rId23" w:history="1">
         <w:r>
           <w:rPr>
             <w:rStyle w:val="Hyperlink"/>
@@ -4289,6 +5853,7 @@
           <w:noProof/>
           <w:lang w:bidi="es-ES"/>
         </w:rPr>
+        <w:lastRenderedPageBreak/>
         <w:drawing>
           <wp:inline distT="0" distB="0" distL="0" distR="0" wp14:anchorId="305B3C6D" wp14:editId="7819EE2B">
             <wp:extent cx="5716270" cy="2562261"/>
@@ -4305,7 +5870,7 @@
                     <pic:cNvPicPr/>
                   </pic:nvPicPr>
                   <pic:blipFill>
-                    <a:blip r:embed="rId19"/>
+                    <a:blip r:embed="rId24"/>
                     <a:stretch>
                       <a:fillRect/>
                     </a:stretch>
@@ -4362,7 +5927,7 @@
                     <pic:cNvPicPr/>
                   </pic:nvPicPr>
                   <pic:blipFill>
-                    <a:blip r:embed="rId20"/>
+                    <a:blip r:embed="rId25"/>
                     <a:stretch>
                       <a:fillRect/>
                     </a:stretch>
@@ -4462,43 +6027,7 @@
           <w:bCs/>
           <w:lang w:bidi="es-ES"/>
         </w:rPr>
-        <w:t xml:space="preserve">: </w:t>
-      </w:r>
-      <w:proofErr w:type="gramStart"/>
-      <w:r>
-        <w:rPr>
-          <w:b w:val="0"/>
-          <w:bCs/>
-          <w:lang w:bidi="es-ES"/>
-        </w:rPr>
-        <w:t>at the moment</w:t>
-      </w:r>
-      <w:proofErr w:type="gramEnd"/>
-      <w:r>
-        <w:rPr>
-          <w:b w:val="0"/>
-          <w:bCs/>
-          <w:lang w:bidi="es-ES"/>
-        </w:rPr>
-        <w:t xml:space="preserve"> of running the benchmark error shows on the interface saying </w:t>
-      </w:r>
-      <w:proofErr w:type="gramStart"/>
-      <w:r>
-        <w:rPr>
-          <w:b w:val="0"/>
-          <w:bCs/>
-          <w:lang w:bidi="es-ES"/>
-        </w:rPr>
-        <w:t>the .prof</w:t>
-      </w:r>
-      <w:proofErr w:type="gramEnd"/>
-      <w:r>
-        <w:rPr>
-          <w:b w:val="0"/>
-          <w:bCs/>
-          <w:lang w:bidi="es-ES"/>
-        </w:rPr>
-        <w:t xml:space="preserve"> and .</w:t>
+        <w:t>: at the moment of running the benchmark error shows on the interface saying the .prof and .</w:t>
       </w:r>
       <w:proofErr w:type="spellStart"/>
       <w:r>
@@ -4612,73 +6141,21 @@
           <w:bCs/>
           <w:color w:val="auto"/>
         </w:rPr>
-        <w:lastRenderedPageBreak/>
-        <w:t xml:space="preserve">In the official testing </w:t>
-      </w:r>
-      <w:proofErr w:type="gramStart"/>
-      <w:r>
-        <w:rPr>
-          <w:b w:val="0"/>
-          <w:bCs/>
+        <w:t xml:space="preserve">In the official testing file the following </w:t>
+      </w:r>
+      <w:r>
+        <w:rPr>
           <w:color w:val="auto"/>
         </w:rPr>
-        <w:t>file</w:t>
-      </w:r>
-      <w:proofErr w:type="gramEnd"/>
+        <w:t>error</w:t>
+      </w:r>
       <w:r>
         <w:rPr>
           <w:b w:val="0"/>
           <w:bCs/>
           <w:color w:val="auto"/>
         </w:rPr>
-        <w:t xml:space="preserve"> t</w:t>
-      </w:r>
-      <w:r>
-        <w:rPr>
-          <w:b w:val="0"/>
-          <w:bCs/>
-          <w:color w:val="auto"/>
-        </w:rPr>
-        <w:t>he</w:t>
-      </w:r>
-      <w:r>
-        <w:rPr>
-          <w:b w:val="0"/>
-          <w:bCs/>
-          <w:color w:val="auto"/>
-        </w:rPr>
-        <w:t xml:space="preserve"> following</w:t>
-      </w:r>
-      <w:r>
-        <w:rPr>
-          <w:b w:val="0"/>
-          <w:bCs/>
-          <w:color w:val="auto"/>
-        </w:rPr>
-        <w:t xml:space="preserve"> </w:t>
-      </w:r>
-      <w:r>
-        <w:rPr>
-          <w:color w:val="auto"/>
-        </w:rPr>
-        <w:t>error</w:t>
-      </w:r>
-      <w:r>
-        <w:rPr>
-          <w:b w:val="0"/>
-          <w:bCs/>
-          <w:color w:val="auto"/>
-        </w:rPr>
-        <w:t xml:space="preserve"> </w:t>
-      </w:r>
-      <w:proofErr w:type="gramStart"/>
-      <w:r>
-        <w:rPr>
-          <w:b w:val="0"/>
-          <w:bCs/>
-          <w:color w:val="auto"/>
-        </w:rPr>
-        <w:t>arose</w:t>
+        <w:t xml:space="preserve"> arose</w:t>
       </w:r>
       <w:r>
         <w:rPr>
@@ -4688,9 +6165,9 @@
           <w:iCs/>
           <w:color w:val="auto"/>
         </w:rPr>
-        <w:t>:</w:t>
-      </w:r>
-      <w:proofErr w:type="gramEnd"/>
+        <w:t>: bash: ./dlrm_s_test.sh: /bin/</w:t>
+      </w:r>
+      <w:proofErr w:type="spellStart"/>
       <w:r>
         <w:rPr>
           <w:b w:val="0"/>
@@ -4699,9 +6176,9 @@
           <w:iCs/>
           <w:color w:val="auto"/>
         </w:rPr>
-        <w:t xml:space="preserve"> bash: ./dlrm_s_test.sh: /bin/</w:t>
-      </w:r>
-      <w:proofErr w:type="spellStart"/>
+        <w:t>bash^M</w:t>
+      </w:r>
+      <w:proofErr w:type="spellEnd"/>
       <w:r>
         <w:rPr>
           <w:b w:val="0"/>
@@ -4710,9 +6187,34 @@
           <w:iCs/>
           <w:color w:val="auto"/>
         </w:rPr>
-        <w:t>bash^M</w:t>
+        <w:t>: bad interpreter: No such file or directory</w:t>
+      </w:r>
+      <w:r>
+        <w:rPr>
+          <w:b w:val="0"/>
+          <w:bCs/>
+          <w:color w:val="auto"/>
+        </w:rPr>
+        <w:t xml:space="preserve">. </w:t>
+      </w:r>
+      <w:proofErr w:type="spellStart"/>
+      <w:r>
+        <w:rPr>
+          <w:b w:val="0"/>
+          <w:bCs/>
+          <w:color w:val="auto"/>
+        </w:rPr>
+        <w:t>Wich</w:t>
       </w:r>
       <w:proofErr w:type="spellEnd"/>
+      <w:r>
+        <w:rPr>
+          <w:b w:val="0"/>
+          <w:bCs/>
+          <w:color w:val="auto"/>
+        </w:rPr>
+        <w:t xml:space="preserve"> means that the </w:t>
+      </w:r>
       <w:r>
         <w:rPr>
           <w:b w:val="0"/>
@@ -4721,7 +6223,7 @@
           <w:iCs/>
           <w:color w:val="auto"/>
         </w:rPr>
-        <w:t>: bad interpreter: No such file or directory</w:t>
+        <w:t>dlrm_s_test.sh</w:t>
       </w:r>
       <w:r>
         <w:rPr>
@@ -4729,85 +6231,7 @@
           <w:bCs/>
           <w:color w:val="auto"/>
         </w:rPr>
-        <w:t xml:space="preserve">. </w:t>
-      </w:r>
-      <w:proofErr w:type="spellStart"/>
-      <w:r>
-        <w:rPr>
-          <w:b w:val="0"/>
-          <w:bCs/>
-          <w:color w:val="auto"/>
-        </w:rPr>
-        <w:t>Wich</w:t>
-      </w:r>
-      <w:proofErr w:type="spellEnd"/>
-      <w:r>
-        <w:rPr>
-          <w:b w:val="0"/>
-          <w:bCs/>
-          <w:color w:val="auto"/>
-        </w:rPr>
-        <w:t xml:space="preserve"> </w:t>
-      </w:r>
-      <w:r>
-        <w:rPr>
-          <w:b w:val="0"/>
-          <w:bCs/>
-          <w:color w:val="auto"/>
-        </w:rPr>
-        <w:t xml:space="preserve">means that </w:t>
-      </w:r>
-      <w:r>
-        <w:rPr>
-          <w:b w:val="0"/>
-          <w:bCs/>
-          <w:color w:val="auto"/>
-        </w:rPr>
-        <w:t>the</w:t>
-      </w:r>
-      <w:r>
-        <w:rPr>
-          <w:b w:val="0"/>
-          <w:bCs/>
-          <w:color w:val="auto"/>
-        </w:rPr>
-        <w:t xml:space="preserve"> </w:t>
-      </w:r>
-      <w:r>
-        <w:rPr>
-          <w:b w:val="0"/>
-          <w:bCs/>
-          <w:i/>
-          <w:iCs/>
-          <w:color w:val="auto"/>
-        </w:rPr>
-        <w:t>dlrm_s_test.sh</w:t>
-      </w:r>
-      <w:r>
-        <w:rPr>
-          <w:b w:val="0"/>
-          <w:bCs/>
-          <w:color w:val="auto"/>
-        </w:rPr>
-        <w:t xml:space="preserve"> file was created or edited on </w:t>
-      </w:r>
-      <w:proofErr w:type="gramStart"/>
-      <w:r>
-        <w:rPr>
-          <w:b w:val="0"/>
-          <w:bCs/>
-          <w:color w:val="auto"/>
-        </w:rPr>
-        <w:t>Windows, and</w:t>
-      </w:r>
-      <w:proofErr w:type="gramEnd"/>
-      <w:r>
-        <w:rPr>
-          <w:b w:val="0"/>
-          <w:bCs/>
-          <w:color w:val="auto"/>
-        </w:rPr>
-        <w:t xml:space="preserve"> contains Windows-style line endings (^M), which breaks the script in Unix/Linux environments.</w:t>
+        <w:t xml:space="preserve"> file was created or edited on Windows, and contains Windows-style line endings (^M), which breaks the script in Unix/Linux environments.</w:t>
       </w:r>
     </w:p>
     <w:p>
@@ -4822,13 +6246,7 @@
         <w:rPr>
           <w:color w:val="auto"/>
         </w:rPr>
-        <w:t>S</w:t>
-      </w:r>
-      <w:r>
-        <w:rPr>
-          <w:color w:val="auto"/>
-        </w:rPr>
-        <w:t>olution</w:t>
+        <w:t>Solution</w:t>
       </w:r>
       <w:r>
         <w:rPr>
@@ -4869,15 +6287,7 @@
           <w:bCs/>
           <w:color w:val="auto"/>
         </w:rPr>
-        <w:t>With the command</w:t>
-      </w:r>
-      <w:r>
-        <w:rPr>
-          <w:b w:val="0"/>
-          <w:bCs/>
-          <w:color w:val="auto"/>
-        </w:rPr>
-        <w:t>: dos2unix dlrm_s_test.sh</w:t>
+        <w:t>With the command: dos2unix dlrm_s_test.sh</w:t>
       </w:r>
     </w:p>
     <w:p>
@@ -4894,16 +6304,14 @@
         </w:rPr>
         <w:t xml:space="preserve">(dos2unix needs to be </w:t>
       </w:r>
-      <w:proofErr w:type="spellStart"/>
       <w:r>
         <w:rPr>
           <w:b w:val="0"/>
           <w:bCs/>
           <w:color w:val="auto"/>
         </w:rPr>
-        <w:t>instaled</w:t>
-      </w:r>
-      <w:proofErr w:type="spellEnd"/>
+        <w:t>installed</w:t>
+      </w:r>
       <w:r>
         <w:rPr>
           <w:b w:val="0"/>
@@ -4927,6 +6335,7 @@
           <w:highlight w:val="yellow"/>
           <w:lang w:bidi="es-ES"/>
         </w:rPr>
+        <w:lastRenderedPageBreak/>
         <w:t>NEXT STEPS:</w:t>
       </w:r>
     </w:p>
@@ -5043,9 +6452,9 @@
     </w:p>
     <w:p/>
     <w:sectPr>
-      <w:headerReference w:type="even" r:id="rId21"/>
-      <w:headerReference w:type="default" r:id="rId22"/>
-      <w:footerReference w:type="even" r:id="rId23"/>
+      <w:headerReference w:type="even" r:id="rId26"/>
+      <w:headerReference w:type="default" r:id="rId27"/>
+      <w:footerReference w:type="even" r:id="rId28"/>
       <w:pgSz w:w="11906" w:h="16838" w:code="9"/>
       <w:pgMar w:top="1152" w:right="1152" w:bottom="720" w:left="1152" w:header="0" w:footer="0" w:gutter="0"/>
       <w:pgNumType w:start="0"/>
@@ -6412,6 +7821,118 @@
     </w:lvl>
   </w:abstractNum>
   <w:abstractNum w:abstractNumId="15" w15:restartNumberingAfterBreak="0">
+    <w:nsid w:val="0C622EC0"/>
+    <w:multiLevelType w:val="hybridMultilevel"/>
+    <w:tmpl w:val="325A33D6"/>
+    <w:lvl w:ilvl="0" w:tplc="757EC42A">
+      <w:numFmt w:val="bullet"/>
+      <w:lvlText w:val="-"/>
+      <w:lvlJc w:val="left"/>
+      <w:pPr>
+        <w:ind w:left="720" w:hanging="360"/>
+      </w:pPr>
+      <w:rPr>
+        <w:rFonts w:ascii="Calibri" w:eastAsiaTheme="minorEastAsia" w:hAnsi="Calibri" w:cs="Calibri" w:hint="default"/>
+      </w:rPr>
+    </w:lvl>
+    <w:lvl w:ilvl="1" w:tplc="0C0A0003" w:tentative="1">
+      <w:start w:val="1"/>
+      <w:numFmt w:val="bullet"/>
+      <w:lvlText w:val="o"/>
+      <w:lvlJc w:val="left"/>
+      <w:pPr>
+        <w:ind w:left="1440" w:hanging="360"/>
+      </w:pPr>
+      <w:rPr>
+        <w:rFonts w:ascii="Courier New" w:hAnsi="Courier New" w:cs="Courier New" w:hint="default"/>
+      </w:rPr>
+    </w:lvl>
+    <w:lvl w:ilvl="2" w:tplc="0C0A0005" w:tentative="1">
+      <w:start w:val="1"/>
+      <w:numFmt w:val="bullet"/>
+      <w:lvlText w:val=""/>
+      <w:lvlJc w:val="left"/>
+      <w:pPr>
+        <w:ind w:left="2160" w:hanging="360"/>
+      </w:pPr>
+      <w:rPr>
+        <w:rFonts w:ascii="Wingdings" w:hAnsi="Wingdings" w:hint="default"/>
+      </w:rPr>
+    </w:lvl>
+    <w:lvl w:ilvl="3" w:tplc="0C0A0001" w:tentative="1">
+      <w:start w:val="1"/>
+      <w:numFmt w:val="bullet"/>
+      <w:lvlText w:val=""/>
+      <w:lvlJc w:val="left"/>
+      <w:pPr>
+        <w:ind w:left="2880" w:hanging="360"/>
+      </w:pPr>
+      <w:rPr>
+        <w:rFonts w:ascii="Symbol" w:hAnsi="Symbol" w:hint="default"/>
+      </w:rPr>
+    </w:lvl>
+    <w:lvl w:ilvl="4" w:tplc="0C0A0003" w:tentative="1">
+      <w:start w:val="1"/>
+      <w:numFmt w:val="bullet"/>
+      <w:lvlText w:val="o"/>
+      <w:lvlJc w:val="left"/>
+      <w:pPr>
+        <w:ind w:left="3600" w:hanging="360"/>
+      </w:pPr>
+      <w:rPr>
+        <w:rFonts w:ascii="Courier New" w:hAnsi="Courier New" w:cs="Courier New" w:hint="default"/>
+      </w:rPr>
+    </w:lvl>
+    <w:lvl w:ilvl="5" w:tplc="0C0A0005" w:tentative="1">
+      <w:start w:val="1"/>
+      <w:numFmt w:val="bullet"/>
+      <w:lvlText w:val=""/>
+      <w:lvlJc w:val="left"/>
+      <w:pPr>
+        <w:ind w:left="4320" w:hanging="360"/>
+      </w:pPr>
+      <w:rPr>
+        <w:rFonts w:ascii="Wingdings" w:hAnsi="Wingdings" w:hint="default"/>
+      </w:rPr>
+    </w:lvl>
+    <w:lvl w:ilvl="6" w:tplc="0C0A0001" w:tentative="1">
+      <w:start w:val="1"/>
+      <w:numFmt w:val="bullet"/>
+      <w:lvlText w:val=""/>
+      <w:lvlJc w:val="left"/>
+      <w:pPr>
+        <w:ind w:left="5040" w:hanging="360"/>
+      </w:pPr>
+      <w:rPr>
+        <w:rFonts w:ascii="Symbol" w:hAnsi="Symbol" w:hint="default"/>
+      </w:rPr>
+    </w:lvl>
+    <w:lvl w:ilvl="7" w:tplc="0C0A0003" w:tentative="1">
+      <w:start w:val="1"/>
+      <w:numFmt w:val="bullet"/>
+      <w:lvlText w:val="o"/>
+      <w:lvlJc w:val="left"/>
+      <w:pPr>
+        <w:ind w:left="5760" w:hanging="360"/>
+      </w:pPr>
+      <w:rPr>
+        <w:rFonts w:ascii="Courier New" w:hAnsi="Courier New" w:cs="Courier New" w:hint="default"/>
+      </w:rPr>
+    </w:lvl>
+    <w:lvl w:ilvl="8" w:tplc="0C0A0005" w:tentative="1">
+      <w:start w:val="1"/>
+      <w:numFmt w:val="bullet"/>
+      <w:lvlText w:val=""/>
+      <w:lvlJc w:val="left"/>
+      <w:pPr>
+        <w:ind w:left="6480" w:hanging="360"/>
+      </w:pPr>
+      <w:rPr>
+        <w:rFonts w:ascii="Wingdings" w:hAnsi="Wingdings" w:hint="default"/>
+      </w:rPr>
+    </w:lvl>
+  </w:abstractNum>
+  <w:abstractNum w:abstractNumId="16" w15:restartNumberingAfterBreak="0">
     <w:nsid w:val="11BC79FA"/>
     <w:multiLevelType w:val="multilevel"/>
     <w:tmpl w:val="923225C0"/>
@@ -6560,7 +8081,7 @@
       </w:rPr>
     </w:lvl>
   </w:abstractNum>
-  <w:abstractNum w:abstractNumId="16" w15:restartNumberingAfterBreak="0">
+  <w:abstractNum w:abstractNumId="17" w15:restartNumberingAfterBreak="0">
     <w:nsid w:val="168C2853"/>
     <w:multiLevelType w:val="multilevel"/>
     <w:tmpl w:val="7DB86958"/>
@@ -6709,7 +8230,7 @@
       </w:rPr>
     </w:lvl>
   </w:abstractNum>
-  <w:abstractNum w:abstractNumId="17" w15:restartNumberingAfterBreak="0">
+  <w:abstractNum w:abstractNumId="18" w15:restartNumberingAfterBreak="0">
     <w:nsid w:val="24BB5AEF"/>
     <w:multiLevelType w:val="hybridMultilevel"/>
     <w:tmpl w:val="B7E42A9E"/>
@@ -6822,7 +8343,120 @@
       </w:rPr>
     </w:lvl>
   </w:abstractNum>
-  <w:abstractNum w:abstractNumId="18" w15:restartNumberingAfterBreak="0">
+  <w:abstractNum w:abstractNumId="19" w15:restartNumberingAfterBreak="0">
+    <w:nsid w:val="2B687243"/>
+    <w:multiLevelType w:val="hybridMultilevel"/>
+    <w:tmpl w:val="31BED0BC"/>
+    <w:lvl w:ilvl="0" w:tplc="0C0A0001">
+      <w:start w:val="1"/>
+      <w:numFmt w:val="bullet"/>
+      <w:lvlText w:val=""/>
+      <w:lvlJc w:val="left"/>
+      <w:pPr>
+        <w:ind w:left="720" w:hanging="360"/>
+      </w:pPr>
+      <w:rPr>
+        <w:rFonts w:ascii="Symbol" w:hAnsi="Symbol" w:hint="default"/>
+      </w:rPr>
+    </w:lvl>
+    <w:lvl w:ilvl="1" w:tplc="0C0A0003" w:tentative="1">
+      <w:start w:val="1"/>
+      <w:numFmt w:val="bullet"/>
+      <w:lvlText w:val="o"/>
+      <w:lvlJc w:val="left"/>
+      <w:pPr>
+        <w:ind w:left="1440" w:hanging="360"/>
+      </w:pPr>
+      <w:rPr>
+        <w:rFonts w:ascii="Courier New" w:hAnsi="Courier New" w:cs="Courier New" w:hint="default"/>
+      </w:rPr>
+    </w:lvl>
+    <w:lvl w:ilvl="2" w:tplc="0C0A0005" w:tentative="1">
+      <w:start w:val="1"/>
+      <w:numFmt w:val="bullet"/>
+      <w:lvlText w:val=""/>
+      <w:lvlJc w:val="left"/>
+      <w:pPr>
+        <w:ind w:left="2160" w:hanging="360"/>
+      </w:pPr>
+      <w:rPr>
+        <w:rFonts w:ascii="Wingdings" w:hAnsi="Wingdings" w:hint="default"/>
+      </w:rPr>
+    </w:lvl>
+    <w:lvl w:ilvl="3" w:tplc="0C0A0001" w:tentative="1">
+      <w:start w:val="1"/>
+      <w:numFmt w:val="bullet"/>
+      <w:lvlText w:val=""/>
+      <w:lvlJc w:val="left"/>
+      <w:pPr>
+        <w:ind w:left="2880" w:hanging="360"/>
+      </w:pPr>
+      <w:rPr>
+        <w:rFonts w:ascii="Symbol" w:hAnsi="Symbol" w:hint="default"/>
+      </w:rPr>
+    </w:lvl>
+    <w:lvl w:ilvl="4" w:tplc="0C0A0003" w:tentative="1">
+      <w:start w:val="1"/>
+      <w:numFmt w:val="bullet"/>
+      <w:lvlText w:val="o"/>
+      <w:lvlJc w:val="left"/>
+      <w:pPr>
+        <w:ind w:left="3600" w:hanging="360"/>
+      </w:pPr>
+      <w:rPr>
+        <w:rFonts w:ascii="Courier New" w:hAnsi="Courier New" w:cs="Courier New" w:hint="default"/>
+      </w:rPr>
+    </w:lvl>
+    <w:lvl w:ilvl="5" w:tplc="0C0A0005" w:tentative="1">
+      <w:start w:val="1"/>
+      <w:numFmt w:val="bullet"/>
+      <w:lvlText w:val=""/>
+      <w:lvlJc w:val="left"/>
+      <w:pPr>
+        <w:ind w:left="4320" w:hanging="360"/>
+      </w:pPr>
+      <w:rPr>
+        <w:rFonts w:ascii="Wingdings" w:hAnsi="Wingdings" w:hint="default"/>
+      </w:rPr>
+    </w:lvl>
+    <w:lvl w:ilvl="6" w:tplc="0C0A0001" w:tentative="1">
+      <w:start w:val="1"/>
+      <w:numFmt w:val="bullet"/>
+      <w:lvlText w:val=""/>
+      <w:lvlJc w:val="left"/>
+      <w:pPr>
+        <w:ind w:left="5040" w:hanging="360"/>
+      </w:pPr>
+      <w:rPr>
+        <w:rFonts w:ascii="Symbol" w:hAnsi="Symbol" w:hint="default"/>
+      </w:rPr>
+    </w:lvl>
+    <w:lvl w:ilvl="7" w:tplc="0C0A0003" w:tentative="1">
+      <w:start w:val="1"/>
+      <w:numFmt w:val="bullet"/>
+      <w:lvlText w:val="o"/>
+      <w:lvlJc w:val="left"/>
+      <w:pPr>
+        <w:ind w:left="5760" w:hanging="360"/>
+      </w:pPr>
+      <w:rPr>
+        <w:rFonts w:ascii="Courier New" w:hAnsi="Courier New" w:cs="Courier New" w:hint="default"/>
+      </w:rPr>
+    </w:lvl>
+    <w:lvl w:ilvl="8" w:tplc="0C0A0005" w:tentative="1">
+      <w:start w:val="1"/>
+      <w:numFmt w:val="bullet"/>
+      <w:lvlText w:val=""/>
+      <w:lvlJc w:val="left"/>
+      <w:pPr>
+        <w:ind w:left="6480" w:hanging="360"/>
+      </w:pPr>
+      <w:rPr>
+        <w:rFonts w:ascii="Wingdings" w:hAnsi="Wingdings" w:hint="default"/>
+      </w:rPr>
+    </w:lvl>
+  </w:abstractNum>
+  <w:abstractNum w:abstractNumId="20" w15:restartNumberingAfterBreak="0">
     <w:nsid w:val="327E40CD"/>
     <w:multiLevelType w:val="multilevel"/>
     <w:tmpl w:val="5944D7BE"/>
@@ -6971,7 +8605,7 @@
       </w:rPr>
     </w:lvl>
   </w:abstractNum>
-  <w:abstractNum w:abstractNumId="19" w15:restartNumberingAfterBreak="0">
+  <w:abstractNum w:abstractNumId="21" w15:restartNumberingAfterBreak="0">
     <w:nsid w:val="329F36A4"/>
     <w:multiLevelType w:val="multilevel"/>
     <w:tmpl w:val="C7C43F88"/>
@@ -7120,7 +8754,7 @@
       </w:rPr>
     </w:lvl>
   </w:abstractNum>
-  <w:abstractNum w:abstractNumId="20" w15:restartNumberingAfterBreak="0">
+  <w:abstractNum w:abstractNumId="22" w15:restartNumberingAfterBreak="0">
     <w:nsid w:val="381E2030"/>
     <w:multiLevelType w:val="multilevel"/>
     <w:tmpl w:val="F858FE9C"/>
@@ -7269,7 +8903,7 @@
       </w:rPr>
     </w:lvl>
   </w:abstractNum>
-  <w:abstractNum w:abstractNumId="21" w15:restartNumberingAfterBreak="0">
+  <w:abstractNum w:abstractNumId="23" w15:restartNumberingAfterBreak="0">
     <w:nsid w:val="3A1C710A"/>
     <w:multiLevelType w:val="hybridMultilevel"/>
     <w:tmpl w:val="63AC482A"/>
@@ -7385,7 +9019,7 @@
       </w:rPr>
     </w:lvl>
   </w:abstractNum>
-  <w:abstractNum w:abstractNumId="22" w15:restartNumberingAfterBreak="0">
+  <w:abstractNum w:abstractNumId="24" w15:restartNumberingAfterBreak="0">
     <w:nsid w:val="444978C0"/>
     <w:multiLevelType w:val="hybridMultilevel"/>
     <w:tmpl w:val="3DE61BDC"/>
@@ -7498,7 +9132,7 @@
       </w:rPr>
     </w:lvl>
   </w:abstractNum>
-  <w:abstractNum w:abstractNumId="23" w15:restartNumberingAfterBreak="0">
+  <w:abstractNum w:abstractNumId="25" w15:restartNumberingAfterBreak="0">
     <w:nsid w:val="4A0B41F7"/>
     <w:multiLevelType w:val="hybridMultilevel"/>
     <w:tmpl w:val="A8206AF4"/>
@@ -7611,7 +9245,7 @@
       </w:rPr>
     </w:lvl>
   </w:abstractNum>
-  <w:abstractNum w:abstractNumId="24" w15:restartNumberingAfterBreak="0">
+  <w:abstractNum w:abstractNumId="26" w15:restartNumberingAfterBreak="0">
     <w:nsid w:val="4A2D60E3"/>
     <w:multiLevelType w:val="multilevel"/>
     <w:tmpl w:val="73DACD56"/>
@@ -7760,7 +9394,7 @@
       </w:rPr>
     </w:lvl>
   </w:abstractNum>
-  <w:abstractNum w:abstractNumId="25" w15:restartNumberingAfterBreak="0">
+  <w:abstractNum w:abstractNumId="27" w15:restartNumberingAfterBreak="0">
     <w:nsid w:val="4B3A398F"/>
     <w:multiLevelType w:val="hybridMultilevel"/>
     <w:tmpl w:val="E57C7778"/>
@@ -7873,7 +9507,7 @@
       </w:rPr>
     </w:lvl>
   </w:abstractNum>
-  <w:abstractNum w:abstractNumId="26" w15:restartNumberingAfterBreak="0">
+  <w:abstractNum w:abstractNumId="28" w15:restartNumberingAfterBreak="0">
     <w:nsid w:val="5053501C"/>
     <w:multiLevelType w:val="hybridMultilevel"/>
     <w:tmpl w:val="101079D2"/>
@@ -7986,7 +9620,7 @@
       </w:rPr>
     </w:lvl>
   </w:abstractNum>
-  <w:abstractNum w:abstractNumId="27" w15:restartNumberingAfterBreak="0">
+  <w:abstractNum w:abstractNumId="29" w15:restartNumberingAfterBreak="0">
     <w:nsid w:val="51626C2C"/>
     <w:multiLevelType w:val="hybridMultilevel"/>
     <w:tmpl w:val="902C59D0"/>
@@ -8099,7 +9733,7 @@
       </w:rPr>
     </w:lvl>
   </w:abstractNum>
-  <w:abstractNum w:abstractNumId="28" w15:restartNumberingAfterBreak="0">
+  <w:abstractNum w:abstractNumId="30" w15:restartNumberingAfterBreak="0">
     <w:nsid w:val="526240E5"/>
     <w:multiLevelType w:val="hybridMultilevel"/>
     <w:tmpl w:val="DCFEADB2"/>
@@ -8213,7 +9847,7 @@
       </w:rPr>
     </w:lvl>
   </w:abstractNum>
-  <w:abstractNum w:abstractNumId="29" w15:restartNumberingAfterBreak="0">
+  <w:abstractNum w:abstractNumId="31" w15:restartNumberingAfterBreak="0">
     <w:nsid w:val="5F936598"/>
     <w:multiLevelType w:val="hybridMultilevel"/>
     <w:tmpl w:val="E48EB1CA"/>
@@ -8325,7 +9959,7 @@
       </w:rPr>
     </w:lvl>
   </w:abstractNum>
-  <w:abstractNum w:abstractNumId="30" w15:restartNumberingAfterBreak="0">
+  <w:abstractNum w:abstractNumId="32" w15:restartNumberingAfterBreak="0">
     <w:nsid w:val="6E242D1C"/>
     <w:multiLevelType w:val="multilevel"/>
     <w:tmpl w:val="71CE495C"/>
@@ -8442,7 +10076,7 @@
       </w:pPr>
     </w:lvl>
   </w:abstractNum>
-  <w:abstractNum w:abstractNumId="31" w15:restartNumberingAfterBreak="0">
+  <w:abstractNum w:abstractNumId="33" w15:restartNumberingAfterBreak="0">
     <w:nsid w:val="730552AC"/>
     <w:multiLevelType w:val="hybridMultilevel"/>
     <w:tmpl w:val="5ADABC18"/>
@@ -8555,7 +10189,7 @@
       </w:rPr>
     </w:lvl>
   </w:abstractNum>
-  <w:abstractNum w:abstractNumId="32" w15:restartNumberingAfterBreak="0">
+  <w:abstractNum w:abstractNumId="34" w15:restartNumberingAfterBreak="0">
     <w:nsid w:val="74D85391"/>
     <w:multiLevelType w:val="multilevel"/>
     <w:tmpl w:val="A2F88B8E"/>
@@ -8695,7 +10329,120 @@
       </w:rPr>
     </w:lvl>
   </w:abstractNum>
-  <w:abstractNum w:abstractNumId="33" w15:restartNumberingAfterBreak="0">
+  <w:abstractNum w:abstractNumId="35" w15:restartNumberingAfterBreak="0">
+    <w:nsid w:val="78ED72D4"/>
+    <w:multiLevelType w:val="hybridMultilevel"/>
+    <w:tmpl w:val="15CEFE04"/>
+    <w:lvl w:ilvl="0" w:tplc="0C0A0001">
+      <w:start w:val="1"/>
+      <w:numFmt w:val="bullet"/>
+      <w:lvlText w:val=""/>
+      <w:lvlJc w:val="left"/>
+      <w:pPr>
+        <w:ind w:left="720" w:hanging="360"/>
+      </w:pPr>
+      <w:rPr>
+        <w:rFonts w:ascii="Symbol" w:hAnsi="Symbol" w:hint="default"/>
+      </w:rPr>
+    </w:lvl>
+    <w:lvl w:ilvl="1" w:tplc="0C0A0003">
+      <w:start w:val="1"/>
+      <w:numFmt w:val="bullet"/>
+      <w:lvlText w:val="o"/>
+      <w:lvlJc w:val="left"/>
+      <w:pPr>
+        <w:ind w:left="1440" w:hanging="360"/>
+      </w:pPr>
+      <w:rPr>
+        <w:rFonts w:ascii="Courier New" w:hAnsi="Courier New" w:cs="Courier New" w:hint="default"/>
+      </w:rPr>
+    </w:lvl>
+    <w:lvl w:ilvl="2" w:tplc="0C0A0005" w:tentative="1">
+      <w:start w:val="1"/>
+      <w:numFmt w:val="bullet"/>
+      <w:lvlText w:val=""/>
+      <w:lvlJc w:val="left"/>
+      <w:pPr>
+        <w:ind w:left="2160" w:hanging="360"/>
+      </w:pPr>
+      <w:rPr>
+        <w:rFonts w:ascii="Wingdings" w:hAnsi="Wingdings" w:hint="default"/>
+      </w:rPr>
+    </w:lvl>
+    <w:lvl w:ilvl="3" w:tplc="0C0A0001" w:tentative="1">
+      <w:start w:val="1"/>
+      <w:numFmt w:val="bullet"/>
+      <w:lvlText w:val=""/>
+      <w:lvlJc w:val="left"/>
+      <w:pPr>
+        <w:ind w:left="2880" w:hanging="360"/>
+      </w:pPr>
+      <w:rPr>
+        <w:rFonts w:ascii="Symbol" w:hAnsi="Symbol" w:hint="default"/>
+      </w:rPr>
+    </w:lvl>
+    <w:lvl w:ilvl="4" w:tplc="0C0A0003" w:tentative="1">
+      <w:start w:val="1"/>
+      <w:numFmt w:val="bullet"/>
+      <w:lvlText w:val="o"/>
+      <w:lvlJc w:val="left"/>
+      <w:pPr>
+        <w:ind w:left="3600" w:hanging="360"/>
+      </w:pPr>
+      <w:rPr>
+        <w:rFonts w:ascii="Courier New" w:hAnsi="Courier New" w:cs="Courier New" w:hint="default"/>
+      </w:rPr>
+    </w:lvl>
+    <w:lvl w:ilvl="5" w:tplc="0C0A0005" w:tentative="1">
+      <w:start w:val="1"/>
+      <w:numFmt w:val="bullet"/>
+      <w:lvlText w:val=""/>
+      <w:lvlJc w:val="left"/>
+      <w:pPr>
+        <w:ind w:left="4320" w:hanging="360"/>
+      </w:pPr>
+      <w:rPr>
+        <w:rFonts w:ascii="Wingdings" w:hAnsi="Wingdings" w:hint="default"/>
+      </w:rPr>
+    </w:lvl>
+    <w:lvl w:ilvl="6" w:tplc="0C0A0001" w:tentative="1">
+      <w:start w:val="1"/>
+      <w:numFmt w:val="bullet"/>
+      <w:lvlText w:val=""/>
+      <w:lvlJc w:val="left"/>
+      <w:pPr>
+        <w:ind w:left="5040" w:hanging="360"/>
+      </w:pPr>
+      <w:rPr>
+        <w:rFonts w:ascii="Symbol" w:hAnsi="Symbol" w:hint="default"/>
+      </w:rPr>
+    </w:lvl>
+    <w:lvl w:ilvl="7" w:tplc="0C0A0003" w:tentative="1">
+      <w:start w:val="1"/>
+      <w:numFmt w:val="bullet"/>
+      <w:lvlText w:val="o"/>
+      <w:lvlJc w:val="left"/>
+      <w:pPr>
+        <w:ind w:left="5760" w:hanging="360"/>
+      </w:pPr>
+      <w:rPr>
+        <w:rFonts w:ascii="Courier New" w:hAnsi="Courier New" w:cs="Courier New" w:hint="default"/>
+      </w:rPr>
+    </w:lvl>
+    <w:lvl w:ilvl="8" w:tplc="0C0A0005" w:tentative="1">
+      <w:start w:val="1"/>
+      <w:numFmt w:val="bullet"/>
+      <w:lvlText w:val=""/>
+      <w:lvlJc w:val="left"/>
+      <w:pPr>
+        <w:ind w:left="6480" w:hanging="360"/>
+      </w:pPr>
+      <w:rPr>
+        <w:rFonts w:ascii="Wingdings" w:hAnsi="Wingdings" w:hint="default"/>
+      </w:rPr>
+    </w:lvl>
+  </w:abstractNum>
+  <w:abstractNum w:abstractNumId="36" w15:restartNumberingAfterBreak="0">
     <w:nsid w:val="79AC0104"/>
     <w:multiLevelType w:val="multilevel"/>
     <w:tmpl w:val="C37E5FFE"/>
@@ -8836,7 +10583,7 @@
       </w:rPr>
     </w:lvl>
   </w:abstractNum>
-  <w:abstractNum w:abstractNumId="34" w15:restartNumberingAfterBreak="0">
+  <w:abstractNum w:abstractNumId="37" w15:restartNumberingAfterBreak="0">
     <w:nsid w:val="7A7063A1"/>
     <w:multiLevelType w:val="multilevel"/>
     <w:tmpl w:val="C004E1FA"/>
@@ -8985,7 +10732,7 @@
       </w:rPr>
     </w:lvl>
   </w:abstractNum>
-  <w:abstractNum w:abstractNumId="35" w15:restartNumberingAfterBreak="0">
+  <w:abstractNum w:abstractNumId="38" w15:restartNumberingAfterBreak="0">
     <w:nsid w:val="7AC5273D"/>
     <w:multiLevelType w:val="multilevel"/>
     <w:tmpl w:val="22D2528A"/>
@@ -9134,7 +10881,7 @@
       </w:rPr>
     </w:lvl>
   </w:abstractNum>
-  <w:abstractNum w:abstractNumId="36" w15:restartNumberingAfterBreak="0">
+  <w:abstractNum w:abstractNumId="39" w15:restartNumberingAfterBreak="0">
     <w:nsid w:val="7B6E7B62"/>
     <w:multiLevelType w:val="hybridMultilevel"/>
     <w:tmpl w:val="0F5EF7E0"/>
@@ -9250,7 +10997,7 @@
       </w:rPr>
     </w:lvl>
   </w:abstractNum>
-  <w:abstractNum w:abstractNumId="37" w15:restartNumberingAfterBreak="0">
+  <w:abstractNum w:abstractNumId="40" w15:restartNumberingAfterBreak="0">
     <w:nsid w:val="7F867F8E"/>
     <w:multiLevelType w:val="hybridMultilevel"/>
     <w:tmpl w:val="80A49A54"/>
@@ -9370,16 +11117,16 @@
     <w:abstractNumId w:val="8"/>
   </w:num>
   <w:num w:numId="2" w16cid:durableId="2049602020">
-    <w:abstractNumId w:val="33"/>
+    <w:abstractNumId w:val="36"/>
   </w:num>
   <w:num w:numId="3" w16cid:durableId="439300098">
-    <w:abstractNumId w:val="36"/>
+    <w:abstractNumId w:val="39"/>
   </w:num>
   <w:num w:numId="4" w16cid:durableId="1387415544">
-    <w:abstractNumId w:val="37"/>
+    <w:abstractNumId w:val="40"/>
   </w:num>
   <w:num w:numId="5" w16cid:durableId="1005597136">
-    <w:abstractNumId w:val="36"/>
+    <w:abstractNumId w:val="39"/>
     <w:lvlOverride w:ilvl="0">
       <w:startOverride w:val="1"/>
     </w:lvlOverride>
@@ -9409,10 +11156,10 @@
     </w:lvlOverride>
   </w:num>
   <w:num w:numId="6" w16cid:durableId="507716300">
-    <w:abstractNumId w:val="21"/>
+    <w:abstractNumId w:val="23"/>
   </w:num>
   <w:num w:numId="7" w16cid:durableId="1066296022">
-    <w:abstractNumId w:val="32"/>
+    <w:abstractNumId w:val="34"/>
   </w:num>
   <w:num w:numId="8" w16cid:durableId="1878157834">
     <w:abstractNumId w:val="7"/>
@@ -9439,22 +11186,22 @@
     <w:abstractNumId w:val="0"/>
   </w:num>
   <w:num w:numId="16" w16cid:durableId="1863473837">
-    <w:abstractNumId w:val="22"/>
+    <w:abstractNumId w:val="24"/>
   </w:num>
   <w:num w:numId="17" w16cid:durableId="1774784208">
-    <w:abstractNumId w:val="28"/>
+    <w:abstractNumId w:val="30"/>
   </w:num>
   <w:num w:numId="18" w16cid:durableId="1305430204">
-    <w:abstractNumId w:val="17"/>
+    <w:abstractNumId w:val="18"/>
   </w:num>
   <w:num w:numId="19" w16cid:durableId="948125345">
-    <w:abstractNumId w:val="25"/>
+    <w:abstractNumId w:val="27"/>
   </w:num>
   <w:num w:numId="20" w16cid:durableId="218907263">
-    <w:abstractNumId w:val="29"/>
+    <w:abstractNumId w:val="31"/>
   </w:num>
   <w:num w:numId="21" w16cid:durableId="724329912">
-    <w:abstractNumId w:val="34"/>
+    <w:abstractNumId w:val="37"/>
     <w:lvlOverride w:ilvl="0">
       <w:lvl w:ilvl="0">
         <w:numFmt w:val="bullet"/>
@@ -9474,7 +11221,7 @@
     </w:lvlOverride>
   </w:num>
   <w:num w:numId="22" w16cid:durableId="2067989517">
-    <w:abstractNumId w:val="19"/>
+    <w:abstractNumId w:val="21"/>
     <w:lvlOverride w:ilvl="0">
       <w:lvl w:ilvl="0">
         <w:numFmt w:val="bullet"/>
@@ -9504,43 +11251,43 @@
     </w:lvlOverride>
   </w:num>
   <w:num w:numId="24" w16cid:durableId="1741244449">
-    <w:abstractNumId w:val="16"/>
+    <w:abstractNumId w:val="17"/>
   </w:num>
   <w:num w:numId="25" w16cid:durableId="573318231">
-    <w:abstractNumId w:val="20"/>
+    <w:abstractNumId w:val="22"/>
   </w:num>
   <w:num w:numId="26" w16cid:durableId="1747998024">
     <w:abstractNumId w:val="12"/>
   </w:num>
   <w:num w:numId="27" w16cid:durableId="276763984">
-    <w:abstractNumId w:val="23"/>
+    <w:abstractNumId w:val="25"/>
   </w:num>
   <w:num w:numId="28" w16cid:durableId="1402560565">
-    <w:abstractNumId w:val="15"/>
+    <w:abstractNumId w:val="16"/>
   </w:num>
   <w:num w:numId="29" w16cid:durableId="729573764">
     <w:abstractNumId w:val="14"/>
   </w:num>
   <w:num w:numId="30" w16cid:durableId="1765759890">
-    <w:abstractNumId w:val="30"/>
+    <w:abstractNumId w:val="32"/>
   </w:num>
   <w:num w:numId="31" w16cid:durableId="198516350">
     <w:abstractNumId w:val="10"/>
   </w:num>
   <w:num w:numId="32" w16cid:durableId="12541537">
-    <w:abstractNumId w:val="31"/>
+    <w:abstractNumId w:val="33"/>
   </w:num>
   <w:num w:numId="33" w16cid:durableId="2008365368">
-    <w:abstractNumId w:val="26"/>
+    <w:abstractNumId w:val="28"/>
   </w:num>
   <w:num w:numId="34" w16cid:durableId="617225755">
-    <w:abstractNumId w:val="18"/>
+    <w:abstractNumId w:val="20"/>
   </w:num>
   <w:num w:numId="35" w16cid:durableId="10302290">
-    <w:abstractNumId w:val="35"/>
+    <w:abstractNumId w:val="38"/>
   </w:num>
   <w:num w:numId="36" w16cid:durableId="1852839879">
-    <w:abstractNumId w:val="24"/>
+    <w:abstractNumId w:val="26"/>
   </w:num>
   <w:num w:numId="37" w16cid:durableId="1991011044">
     <w:abstractNumId w:val="11"/>
@@ -9549,7 +11296,16 @@
     <w:abstractNumId w:val="9"/>
   </w:num>
   <w:num w:numId="39" w16cid:durableId="2045133013">
-    <w:abstractNumId w:val="27"/>
+    <w:abstractNumId w:val="29"/>
+  </w:num>
+  <w:num w:numId="40" w16cid:durableId="635992753">
+    <w:abstractNumId w:val="19"/>
+  </w:num>
+  <w:num w:numId="41" w16cid:durableId="1979604422">
+    <w:abstractNumId w:val="15"/>
+  </w:num>
+  <w:num w:numId="42" w16cid:durableId="963147893">
+    <w:abstractNumId w:val="35"/>
   </w:num>
 </w:numbering>
 </file>
@@ -10651,12 +12407,14 @@
     <w:rsid w:val="00271076"/>
     <w:rsid w:val="00320001"/>
     <w:rsid w:val="00341145"/>
+    <w:rsid w:val="003814C5"/>
     <w:rsid w:val="003F2A7A"/>
     <w:rsid w:val="00414A4B"/>
     <w:rsid w:val="00506A92"/>
     <w:rsid w:val="0053661F"/>
     <w:rsid w:val="0054148F"/>
     <w:rsid w:val="005501C6"/>
+    <w:rsid w:val="005C3451"/>
     <w:rsid w:val="006508BD"/>
     <w:rsid w:val="006B2EDB"/>
     <w:rsid w:val="00704F2D"/>

</xml_diff>